<commit_message>
feat: enhance essay grading pipeline with new features and layout adjustments
- Introduced a new function to draw red tick marks on annotated PDF pages for visual feedback.
- Adjusted side margins for essay body to ensure equal spacing, improving overall layout.
- Updated page size calculations to accommodate new margin settings and prevent memory issues.
- Added a new script for grading PDF answers, integrating OCR and structured grading processes.
- Implemented chunking for page images to optimize API calls and manage large documents effectively.

These changes enhance the user experience by providing clearer visual indicators and improving the grading workflow.
</commit_message>
<xml_diff>
--- a/CSS English Essay Evaluation Rubric Based on FPSC Examiners.docx
+++ b/CSS English Essay Evaluation Rubric Based on FPSC Examiners.docx
@@ -4,11 +4,9 @@
   <w:body>
     <w:p>
       <w:pPr>
-        <w:numPr>
-          <w:ilvl w:val="0"/>
-          <w:numId w:val="1"/>
-        </w:numPr>
-        <w:spacing w:before="100" w:beforeAutospacing="1" w:after="100" w:afterAutospacing="1" w:line="240" w:lineRule="auto"/>
+        <w:spacing w:before="100" w:beforeAutospacing="1" w:after="100" w:afterAutospacing="1" w:line="240" w:lineRule="auto"/>
+        <w:ind w:left="720"/>
+        <w:jc w:val="center"/>
         <w:rPr>
           <w:rFonts w:ascii="Times New Roman" w:eastAsia="Times New Roman" w:hAnsi="Times New Roman" w:cs="Times New Roman"/>
           <w:kern w:val="0"/>
@@ -34,8 +32,21 @@
           <w:sz w:val="24"/>
           <w:szCs w:val="24"/>
         </w:rPr>
-        <w:t xml:space="preserve"> Based on FPSC Examiners' Reports and Subject Experts' Guidelines </w:t>
-      </w:r>
+        <w:t xml:space="preserve"> </w:t>
+      </w:r>
+    </w:p>
+    <w:p>
+      <w:pPr>
+        <w:spacing w:before="100" w:beforeAutospacing="1" w:after="100" w:afterAutospacing="1" w:line="240" w:lineRule="auto"/>
+        <w:ind w:left="720"/>
+        <w:jc w:val="center"/>
+        <w:rPr>
+          <w:rFonts w:ascii="Times New Roman" w:eastAsia="Times New Roman" w:hAnsi="Times New Roman" w:cs="Times New Roman"/>
+          <w:kern w:val="0"/>
+          <w:sz w:val="24"/>
+          <w:szCs w:val="24"/>
+        </w:rPr>
+      </w:pPr>
       <w:r>
         <w:rPr>
           <w:rFonts w:ascii="Times New Roman" w:eastAsia="Times New Roman" w:hAnsi="Times New Roman" w:cs="Times New Roman"/>
@@ -339,10 +350,6 @@
     </w:p>
     <w:p>
       <w:pPr>
-        <w:numPr>
-          <w:ilvl w:val="0"/>
-          <w:numId w:val="1"/>
-        </w:numPr>
         <w:spacing w:before="100" w:beforeAutospacing="1" w:after="100" w:afterAutospacing="1" w:line="240" w:lineRule="auto"/>
         <w:rPr>
           <w:rFonts w:ascii="Times New Roman" w:eastAsia="Times New Roman" w:hAnsi="Times New Roman" w:cs="Times New Roman"/>
@@ -396,34 +403,46 @@
           <w:sz w:val="24"/>
           <w:szCs w:val="24"/>
         </w:rPr>
-        <w:t xml:space="preserve">Purpose: To check planning, logical arrangement, and balanced structure with a clear beginning, middle, and end. </w:t>
-      </w:r>
-      <w:r>
-        <w:rPr>
-          <w:rFonts w:ascii="Times New Roman" w:eastAsia="Times New Roman" w:hAnsi="Times New Roman" w:cs="Times New Roman"/>
-          <w:kern w:val="0"/>
-          <w:sz w:val="24"/>
-          <w:szCs w:val="24"/>
-        </w:rPr>
         <w:br/>
       </w:r>
       <w:r>
         <w:rPr>
           <w:rFonts w:ascii="Times New Roman" w:eastAsia="Times New Roman" w:hAnsi="Times New Roman" w:cs="Times New Roman"/>
-          <w:kern w:val="0"/>
-          <w:sz w:val="24"/>
-          <w:szCs w:val="24"/>
-        </w:rPr>
-        <w:br/>
-      </w:r>
-      <w:r>
-        <w:rPr>
-          <w:rFonts w:ascii="Times New Roman" w:eastAsia="Times New Roman" w:hAnsi="Times New Roman" w:cs="Times New Roman"/>
-          <w:kern w:val="0"/>
-          <w:sz w:val="24"/>
-          <w:szCs w:val="24"/>
-        </w:rPr>
-        <w:t>Key signs: Correct understanding of the topic; choosing the right position; supporting that position with main and sub-headings; including solutions or suggestions where needed; clear step-by-step outline; covers everything required; balanced sections; no missing or mismatched parts.</w:t>
+          <w:b/>
+          <w:kern w:val="0"/>
+          <w:sz w:val="24"/>
+          <w:szCs w:val="24"/>
+        </w:rPr>
+        <w:t xml:space="preserve">Key </w:t>
+      </w:r>
+      <w:r>
+        <w:rPr>
+          <w:rFonts w:ascii="Times New Roman" w:eastAsia="Times New Roman" w:hAnsi="Times New Roman" w:cs="Times New Roman"/>
+          <w:b/>
+          <w:kern w:val="0"/>
+          <w:sz w:val="24"/>
+          <w:szCs w:val="24"/>
+        </w:rPr>
+        <w:t>indicators</w:t>
+      </w:r>
+      <w:r>
+        <w:rPr>
+          <w:rFonts w:ascii="Times New Roman" w:eastAsia="Times New Roman" w:hAnsi="Times New Roman" w:cs="Times New Roman"/>
+          <w:b/>
+          <w:kern w:val="0"/>
+          <w:sz w:val="24"/>
+          <w:szCs w:val="24"/>
+        </w:rPr>
+        <w:t>:</w:t>
+      </w:r>
+      <w:r>
+        <w:rPr>
+          <w:rFonts w:ascii="Times New Roman" w:eastAsia="Times New Roman" w:hAnsi="Times New Roman" w:cs="Times New Roman"/>
+          <w:kern w:val="0"/>
+          <w:sz w:val="24"/>
+          <w:szCs w:val="24"/>
+        </w:rPr>
+        <w:t xml:space="preserve"> </w:t>
       </w:r>
       <w:r>
         <w:rPr>
@@ -456,7 +475,43 @@
           <w:sz w:val="24"/>
           <w:szCs w:val="24"/>
         </w:rPr>
-        <w:t>Excellent (36–40 marks): Full, logical, and balanced outline that perfectly matches the essay content</w:t>
+        <w:t>Outline depicts c</w:t>
+      </w:r>
+      <w:r>
+        <w:rPr>
+          <w:rFonts w:ascii="Times New Roman" w:eastAsia="Times New Roman" w:hAnsi="Times New Roman" w:cs="Times New Roman"/>
+          <w:kern w:val="0"/>
+          <w:sz w:val="24"/>
+          <w:szCs w:val="24"/>
+        </w:rPr>
+        <w:t>orrect understanding</w:t>
+      </w:r>
+      <w:r>
+        <w:rPr>
+          <w:rFonts w:ascii="Times New Roman" w:eastAsia="Times New Roman" w:hAnsi="Times New Roman" w:cs="Times New Roman"/>
+          <w:kern w:val="0"/>
+          <w:sz w:val="24"/>
+          <w:szCs w:val="24"/>
+        </w:rPr>
+        <w:t xml:space="preserve"> and</w:t>
+      </w:r>
+      <w:r>
+        <w:rPr>
+          <w:rFonts w:ascii="Times New Roman" w:eastAsia="Times New Roman" w:hAnsi="Times New Roman" w:cs="Times New Roman"/>
+          <w:kern w:val="0"/>
+          <w:sz w:val="24"/>
+          <w:szCs w:val="24"/>
+        </w:rPr>
+        <w:t xml:space="preserve"> </w:t>
+      </w:r>
+      <w:r>
+        <w:rPr>
+          <w:rFonts w:ascii="Times New Roman" w:eastAsia="Times New Roman" w:hAnsi="Times New Roman" w:cs="Times New Roman"/>
+          <w:kern w:val="0"/>
+          <w:sz w:val="24"/>
+          <w:szCs w:val="24"/>
+        </w:rPr>
+        <w:t>interpretation of the essay prompt.</w:t>
       </w:r>
     </w:p>
     <w:p>
@@ -480,7 +535,70 @@
           <w:sz w:val="24"/>
           <w:szCs w:val="24"/>
         </w:rPr>
-        <w:t>Good (28–35 marks): Clear outline with small mismatches or slightly uneven parts</w:t>
+        <w:t>Arguments in the outline are relevant</w:t>
+      </w:r>
+      <w:r>
+        <w:rPr>
+          <w:rFonts w:ascii="Times New Roman" w:eastAsia="Times New Roman" w:hAnsi="Times New Roman" w:cs="Times New Roman"/>
+          <w:kern w:val="0"/>
+          <w:sz w:val="24"/>
+          <w:szCs w:val="24"/>
+        </w:rPr>
+        <w:t xml:space="preserve"> to the essay prompt and represent</w:t>
+      </w:r>
+      <w:r>
+        <w:rPr>
+          <w:rFonts w:ascii="Times New Roman" w:eastAsia="Times New Roman" w:hAnsi="Times New Roman" w:cs="Times New Roman"/>
+          <w:kern w:val="0"/>
+          <w:sz w:val="24"/>
+          <w:szCs w:val="24"/>
+        </w:rPr>
+        <w:t xml:space="preserve"> clear stance</w:t>
+      </w:r>
+      <w:r>
+        <w:rPr>
+          <w:rFonts w:ascii="Times New Roman" w:eastAsia="Times New Roman" w:hAnsi="Times New Roman" w:cs="Times New Roman"/>
+          <w:kern w:val="0"/>
+          <w:sz w:val="24"/>
+          <w:szCs w:val="24"/>
+        </w:rPr>
+        <w:t xml:space="preserve"> </w:t>
+      </w:r>
+      <w:r>
+        <w:rPr>
+          <w:rFonts w:ascii="Times New Roman" w:eastAsia="Times New Roman" w:hAnsi="Times New Roman" w:cs="Times New Roman"/>
+          <w:kern w:val="0"/>
+          <w:sz w:val="24"/>
+          <w:szCs w:val="24"/>
+        </w:rPr>
+        <w:t xml:space="preserve">along </w:t>
+      </w:r>
+      <w:r>
+        <w:rPr>
+          <w:rFonts w:ascii="Times New Roman" w:eastAsia="Times New Roman" w:hAnsi="Times New Roman" w:cs="Times New Roman"/>
+          <w:kern w:val="0"/>
+          <w:sz w:val="24"/>
+          <w:szCs w:val="24"/>
+        </w:rPr>
+        <w:t>with</w:t>
+      </w:r>
+      <w:r>
+        <w:rPr>
+          <w:rFonts w:ascii="Times New Roman" w:eastAsia="Times New Roman" w:hAnsi="Times New Roman" w:cs="Times New Roman"/>
+          <w:kern w:val="0"/>
+          <w:sz w:val="24"/>
+          <w:szCs w:val="24"/>
+        </w:rPr>
+        <w:t xml:space="preserve"> in-depth understanding of the topic</w:t>
+      </w:r>
+      <w:r>
+        <w:rPr>
+          <w:rFonts w:ascii="Times New Roman" w:eastAsia="Times New Roman" w:hAnsi="Times New Roman" w:cs="Times New Roman"/>
+          <w:kern w:val="0"/>
+          <w:sz w:val="24"/>
+          <w:szCs w:val="24"/>
+        </w:rPr>
+        <w:t>.</w:t>
       </w:r>
     </w:p>
     <w:p>
@@ -504,7 +622,79 @@
           <w:sz w:val="24"/>
           <w:szCs w:val="24"/>
         </w:rPr>
-        <w:t>Average (16–27 marks): Simple outline that is incomplete or not properly ordered</w:t>
+        <w:t>Outline sections must be ba</w:t>
+      </w:r>
+      <w:r>
+        <w:rPr>
+          <w:rFonts w:ascii="Times New Roman" w:eastAsia="Times New Roman" w:hAnsi="Times New Roman" w:cs="Times New Roman"/>
+          <w:kern w:val="0"/>
+          <w:sz w:val="24"/>
+          <w:szCs w:val="24"/>
+        </w:rPr>
+        <w:t>lanced;</w:t>
+      </w:r>
+      <w:r>
+        <w:rPr>
+          <w:rFonts w:ascii="Times New Roman" w:eastAsia="Times New Roman" w:hAnsi="Times New Roman" w:cs="Times New Roman"/>
+          <w:kern w:val="0"/>
+          <w:sz w:val="24"/>
+          <w:szCs w:val="24"/>
+        </w:rPr>
+        <w:t xml:space="preserve"> more </w:t>
+      </w:r>
+      <w:r>
+        <w:rPr>
+          <w:rFonts w:ascii="Times New Roman" w:eastAsia="Times New Roman" w:hAnsi="Times New Roman" w:cs="Times New Roman"/>
+          <w:kern w:val="0"/>
+          <w:sz w:val="24"/>
+          <w:szCs w:val="24"/>
+        </w:rPr>
+        <w:t>weight-</w:t>
+      </w:r>
+      <w:r>
+        <w:rPr>
+          <w:rFonts w:ascii="Times New Roman" w:eastAsia="Times New Roman" w:hAnsi="Times New Roman" w:cs="Times New Roman"/>
+          <w:kern w:val="0"/>
+          <w:sz w:val="24"/>
+          <w:szCs w:val="24"/>
+        </w:rPr>
+        <w:t xml:space="preserve">age </w:t>
+      </w:r>
+      <w:r>
+        <w:rPr>
+          <w:rFonts w:ascii="Times New Roman" w:eastAsia="Times New Roman" w:hAnsi="Times New Roman" w:cs="Times New Roman"/>
+          <w:kern w:val="0"/>
+          <w:sz w:val="24"/>
+          <w:szCs w:val="24"/>
+        </w:rPr>
+        <w:t xml:space="preserve">should be </w:t>
+      </w:r>
+      <w:r>
+        <w:rPr>
+          <w:rFonts w:ascii="Times New Roman" w:eastAsia="Times New Roman" w:hAnsi="Times New Roman" w:cs="Times New Roman"/>
+          <w:kern w:val="0"/>
+          <w:sz w:val="24"/>
+          <w:szCs w:val="24"/>
+        </w:rPr>
+        <w:t>given to arguments directly</w:t>
+      </w:r>
+      <w:r>
+        <w:rPr>
+          <w:rFonts w:ascii="Times New Roman" w:eastAsia="Times New Roman" w:hAnsi="Times New Roman" w:cs="Times New Roman"/>
+          <w:kern w:val="0"/>
+          <w:sz w:val="24"/>
+          <w:szCs w:val="24"/>
+        </w:rPr>
+        <w:t xml:space="preserve"> addressing the essay prompt</w:t>
+      </w:r>
+      <w:r>
+        <w:rPr>
+          <w:rFonts w:ascii="Times New Roman" w:eastAsia="Times New Roman" w:hAnsi="Times New Roman" w:cs="Times New Roman"/>
+          <w:kern w:val="0"/>
+          <w:sz w:val="24"/>
+          <w:szCs w:val="24"/>
+        </w:rPr>
+        <w:t xml:space="preserve">. </w:t>
       </w:r>
     </w:p>
     <w:p>
@@ -528,13 +718,57 @@
           <w:sz w:val="24"/>
           <w:szCs w:val="24"/>
         </w:rPr>
-        <w:t>Weak (0–15 marks): Unclear, missing, or outline does not match the essay at all</w:t>
-      </w:r>
-    </w:p>
-    <w:p>
-      <w:pPr>
-        <w:spacing w:before="100" w:beforeAutospacing="1" w:after="100" w:afterAutospacing="1" w:line="240" w:lineRule="auto"/>
-        <w:ind w:left="720"/>
+        <w:t>No argument should</w:t>
+      </w:r>
+      <w:r>
+        <w:rPr>
+          <w:rFonts w:ascii="Times New Roman" w:eastAsia="Times New Roman" w:hAnsi="Times New Roman" w:cs="Times New Roman"/>
+          <w:kern w:val="0"/>
+          <w:sz w:val="24"/>
+          <w:szCs w:val="24"/>
+        </w:rPr>
+        <w:t xml:space="preserve"> be present </w:t>
+      </w:r>
+      <w:r>
+        <w:rPr>
+          <w:rFonts w:ascii="Times New Roman" w:eastAsia="Times New Roman" w:hAnsi="Times New Roman" w:cs="Times New Roman"/>
+          <w:kern w:val="0"/>
+          <w:sz w:val="24"/>
+          <w:szCs w:val="24"/>
+        </w:rPr>
+        <w:t xml:space="preserve">in the outline </w:t>
+      </w:r>
+      <w:r>
+        <w:rPr>
+          <w:rFonts w:ascii="Times New Roman" w:eastAsia="Times New Roman" w:hAnsi="Times New Roman" w:cs="Times New Roman"/>
+          <w:kern w:val="0"/>
+          <w:sz w:val="24"/>
+          <w:szCs w:val="24"/>
+        </w:rPr>
+        <w:t>that does not dire</w:t>
+      </w:r>
+      <w:r>
+        <w:rPr>
+          <w:rFonts w:ascii="Times New Roman" w:eastAsia="Times New Roman" w:hAnsi="Times New Roman" w:cs="Times New Roman"/>
+          <w:kern w:val="0"/>
+          <w:sz w:val="24"/>
+          <w:szCs w:val="24"/>
+        </w:rPr>
+        <w:t>ctly address the essay prompt</w:t>
+      </w:r>
+      <w:r>
+        <w:rPr>
+          <w:rFonts w:ascii="Times New Roman" w:eastAsia="Times New Roman" w:hAnsi="Times New Roman" w:cs="Times New Roman"/>
+          <w:kern w:val="0"/>
+          <w:sz w:val="24"/>
+          <w:szCs w:val="24"/>
+        </w:rPr>
+        <w:t xml:space="preserve">. </w:t>
+      </w:r>
+    </w:p>
+    <w:p>
+      <w:pPr>
+        <w:spacing w:before="100" w:beforeAutospacing="1" w:after="100" w:afterAutospacing="1" w:line="240" w:lineRule="auto"/>
         <w:rPr>
           <w:rFonts w:ascii="Times New Roman" w:eastAsia="Times New Roman" w:hAnsi="Times New Roman" w:cs="Times New Roman"/>
           <w:kern w:val="0"/>
@@ -620,15 +854,6 @@
           <w:sz w:val="24"/>
           <w:szCs w:val="24"/>
         </w:rPr>
-        <w:t xml:space="preserve">Purpose: To judge the opening, understanding of the topic, and clear statement of position/thesis. </w:t>
-      </w:r>
-      <w:r>
-        <w:rPr>
-          <w:rFonts w:ascii="Times New Roman" w:eastAsia="Times New Roman" w:hAnsi="Times New Roman" w:cs="Times New Roman"/>
-          <w:kern w:val="0"/>
-          <w:sz w:val="24"/>
-          <w:szCs w:val="24"/>
-        </w:rPr>
         <w:br/>
       </w:r>
       <w:r>
@@ -638,128 +863,190 @@
           <w:sz w:val="24"/>
           <w:szCs w:val="24"/>
         </w:rPr>
+        <w:t>Key indicators</w:t>
+      </w:r>
+      <w:r>
+        <w:rPr>
+          <w:rFonts w:ascii="Times New Roman" w:eastAsia="Times New Roman" w:hAnsi="Times New Roman" w:cs="Times New Roman"/>
+          <w:kern w:val="0"/>
+          <w:sz w:val="24"/>
+          <w:szCs w:val="24"/>
+        </w:rPr>
+        <w:t xml:space="preserve">: </w:t>
+      </w:r>
+    </w:p>
+    <w:p>
+      <w:pPr>
+        <w:pStyle w:val="ListParagraph"/>
+        <w:numPr>
+          <w:ilvl w:val="0"/>
+          <w:numId w:val="2"/>
+        </w:numPr>
+        <w:spacing w:before="100" w:beforeAutospacing="1" w:after="100" w:afterAutospacing="1" w:line="240" w:lineRule="auto"/>
+        <w:rPr>
+          <w:rFonts w:ascii="Times New Roman" w:eastAsia="Times New Roman" w:hAnsi="Times New Roman" w:cs="Times New Roman"/>
+          <w:kern w:val="0"/>
+          <w:sz w:val="24"/>
+          <w:szCs w:val="24"/>
+        </w:rPr>
+      </w:pPr>
+      <w:r>
+        <w:rPr>
+          <w:rFonts w:ascii="Times New Roman" w:eastAsia="Times New Roman" w:hAnsi="Times New Roman" w:cs="Times New Roman"/>
+          <w:kern w:val="0"/>
+          <w:sz w:val="24"/>
+          <w:szCs w:val="24"/>
+        </w:rPr>
+        <w:t>Introduction shoul</w:t>
+      </w:r>
+      <w:r>
+        <w:rPr>
+          <w:rFonts w:ascii="Times New Roman" w:eastAsia="Times New Roman" w:hAnsi="Times New Roman" w:cs="Times New Roman"/>
+          <w:kern w:val="0"/>
+          <w:sz w:val="24"/>
+          <w:szCs w:val="24"/>
+        </w:rPr>
+        <w:t>d give an overview of the essay; it should act as a short</w:t>
+      </w:r>
+      <w:r>
+        <w:rPr>
+          <w:rFonts w:ascii="Times New Roman" w:eastAsia="Times New Roman" w:hAnsi="Times New Roman" w:cs="Times New Roman"/>
+          <w:kern w:val="0"/>
+          <w:sz w:val="24"/>
+          <w:szCs w:val="24"/>
+        </w:rPr>
+        <w:t xml:space="preserve"> summary of the essay</w:t>
+      </w:r>
+      <w:r>
+        <w:rPr>
+          <w:rFonts w:ascii="Times New Roman" w:eastAsia="Times New Roman" w:hAnsi="Times New Roman" w:cs="Times New Roman"/>
+          <w:kern w:val="0"/>
+          <w:sz w:val="24"/>
+          <w:szCs w:val="24"/>
+        </w:rPr>
+        <w:t>.</w:t>
+      </w:r>
+      <w:r>
+        <w:rPr>
+          <w:rFonts w:ascii="Times New Roman" w:eastAsia="Times New Roman" w:hAnsi="Times New Roman" w:cs="Times New Roman"/>
+          <w:kern w:val="0"/>
+          <w:sz w:val="24"/>
+          <w:szCs w:val="24"/>
+        </w:rPr>
+        <w:t xml:space="preserve"> </w:t>
+      </w:r>
+    </w:p>
+    <w:p>
+      <w:pPr>
+        <w:pStyle w:val="ListParagraph"/>
+        <w:numPr>
+          <w:ilvl w:val="0"/>
+          <w:numId w:val="2"/>
+        </w:numPr>
+        <w:spacing w:before="100" w:beforeAutospacing="1" w:after="100" w:afterAutospacing="1" w:line="240" w:lineRule="auto"/>
+        <w:rPr>
+          <w:rFonts w:ascii="Times New Roman" w:eastAsia="Times New Roman" w:hAnsi="Times New Roman" w:cs="Times New Roman"/>
+          <w:kern w:val="0"/>
+          <w:sz w:val="24"/>
+          <w:szCs w:val="24"/>
+        </w:rPr>
+      </w:pPr>
+      <w:r>
+        <w:rPr>
+          <w:rFonts w:ascii="Times New Roman" w:eastAsia="Times New Roman" w:hAnsi="Times New Roman" w:cs="Times New Roman"/>
+          <w:kern w:val="0"/>
+          <w:sz w:val="24"/>
+          <w:szCs w:val="24"/>
+        </w:rPr>
+        <w:t>It should present clear stance</w:t>
+      </w:r>
+      <w:r>
+        <w:rPr>
+          <w:rFonts w:ascii="Times New Roman" w:eastAsia="Times New Roman" w:hAnsi="Times New Roman" w:cs="Times New Roman"/>
+          <w:kern w:val="0"/>
+          <w:sz w:val="24"/>
+          <w:szCs w:val="24"/>
+        </w:rPr>
+        <w:t xml:space="preserve"> from the beginning.</w:t>
+      </w:r>
+    </w:p>
+    <w:p>
+      <w:pPr>
+        <w:pStyle w:val="ListParagraph"/>
+        <w:numPr>
+          <w:ilvl w:val="0"/>
+          <w:numId w:val="2"/>
+        </w:numPr>
+        <w:spacing w:before="100" w:beforeAutospacing="1" w:after="100" w:afterAutospacing="1" w:line="240" w:lineRule="auto"/>
+        <w:rPr>
+          <w:rFonts w:ascii="Times New Roman" w:eastAsia="Times New Roman" w:hAnsi="Times New Roman" w:cs="Times New Roman"/>
+          <w:kern w:val="0"/>
+          <w:sz w:val="24"/>
+          <w:szCs w:val="24"/>
+        </w:rPr>
+      </w:pPr>
+      <w:r>
+        <w:rPr>
+          <w:rFonts w:ascii="Times New Roman" w:eastAsia="Times New Roman" w:hAnsi="Times New Roman" w:cs="Times New Roman"/>
+          <w:kern w:val="0"/>
+          <w:sz w:val="24"/>
+          <w:szCs w:val="24"/>
+        </w:rPr>
+        <w:t xml:space="preserve">Introduction should reflect </w:t>
+      </w:r>
+      <w:r>
+        <w:rPr>
+          <w:rFonts w:ascii="Times New Roman" w:eastAsia="Times New Roman" w:hAnsi="Times New Roman" w:cs="Times New Roman"/>
+          <w:kern w:val="0"/>
+          <w:sz w:val="24"/>
+          <w:szCs w:val="24"/>
+        </w:rPr>
+        <w:t>correct understanding</w:t>
+      </w:r>
+      <w:r>
+        <w:rPr>
+          <w:rFonts w:ascii="Times New Roman" w:eastAsia="Times New Roman" w:hAnsi="Times New Roman" w:cs="Times New Roman"/>
+          <w:kern w:val="0"/>
+          <w:sz w:val="24"/>
+          <w:szCs w:val="24"/>
+        </w:rPr>
+        <w:t xml:space="preserve"> of the essay prompt.</w:t>
+      </w:r>
+      <w:r>
+        <w:rPr>
+          <w:rFonts w:ascii="Times New Roman" w:eastAsia="Times New Roman" w:hAnsi="Times New Roman" w:cs="Times New Roman"/>
+          <w:kern w:val="0"/>
+          <w:sz w:val="24"/>
+          <w:szCs w:val="24"/>
+        </w:rPr>
+        <w:t xml:space="preserve"> </w:t>
+      </w:r>
+    </w:p>
+    <w:p>
+      <w:pPr>
+        <w:spacing w:before="100" w:beforeAutospacing="1" w:after="100" w:afterAutospacing="1" w:line="240" w:lineRule="auto"/>
+        <w:ind w:left="1440"/>
+        <w:rPr>
+          <w:rFonts w:ascii="Times New Roman" w:eastAsia="Times New Roman" w:hAnsi="Times New Roman" w:cs="Times New Roman"/>
+          <w:kern w:val="0"/>
+          <w:sz w:val="24"/>
+          <w:szCs w:val="24"/>
+        </w:rPr>
+      </w:pPr>
+      <w:r>
+        <w:rPr>
+          <w:rFonts w:ascii="Times New Roman" w:eastAsia="Times New Roman" w:hAnsi="Times New Roman" w:cs="Times New Roman"/>
+          <w:kern w:val="0"/>
+          <w:sz w:val="24"/>
+          <w:szCs w:val="24"/>
+        </w:rPr>
+        <w:lastRenderedPageBreak/>
         <w:br/>
       </w:r>
-      <w:r>
-        <w:rPr>
-          <w:rFonts w:ascii="Times New Roman" w:eastAsia="Times New Roman" w:hAnsi="Times New Roman" w:cs="Times New Roman"/>
-          <w:kern w:val="0"/>
-          <w:sz w:val="24"/>
-          <w:szCs w:val="24"/>
-        </w:rPr>
-        <w:t>Key signs: Brief overview of the outline; short summary of the essay; connection to the topic; shows correct understanding; clear personal position from the beginning.</w:t>
-      </w:r>
-    </w:p>
-    <w:p>
-      <w:pPr>
-        <w:numPr>
-          <w:ilvl w:val="1"/>
-          <w:numId w:val="1"/>
-        </w:numPr>
-        <w:spacing w:before="100" w:beforeAutospacing="1" w:after="100" w:afterAutospacing="1" w:line="240" w:lineRule="auto"/>
-        <w:rPr>
-          <w:rFonts w:ascii="Times New Roman" w:eastAsia="Times New Roman" w:hAnsi="Times New Roman" w:cs="Times New Roman"/>
-          <w:kern w:val="0"/>
-          <w:sz w:val="24"/>
-          <w:szCs w:val="24"/>
-        </w:rPr>
-      </w:pPr>
-      <w:r>
-        <w:rPr>
-          <w:rFonts w:ascii="Times New Roman" w:eastAsia="Times New Roman" w:hAnsi="Times New Roman" w:cs="Times New Roman"/>
-          <w:kern w:val="0"/>
-          <w:sz w:val="24"/>
-          <w:szCs w:val="24"/>
-        </w:rPr>
-        <w:lastRenderedPageBreak/>
-        <w:t>Excellent (13–15 marks): Interesting and exact opening with a strong and clear thesis</w:t>
-      </w:r>
-    </w:p>
-    <w:p>
-      <w:pPr>
-        <w:numPr>
-          <w:ilvl w:val="1"/>
-          <w:numId w:val="1"/>
-        </w:numPr>
-        <w:spacing w:before="100" w:beforeAutospacing="1" w:after="100" w:afterAutospacing="1" w:line="240" w:lineRule="auto"/>
-        <w:rPr>
-          <w:rFonts w:ascii="Times New Roman" w:eastAsia="Times New Roman" w:hAnsi="Times New Roman" w:cs="Times New Roman"/>
-          <w:kern w:val="0"/>
-          <w:sz w:val="24"/>
-          <w:szCs w:val="24"/>
-        </w:rPr>
-      </w:pPr>
-      <w:r>
-        <w:rPr>
-          <w:rFonts w:ascii="Times New Roman" w:eastAsia="Times New Roman" w:hAnsi="Times New Roman" w:cs="Times New Roman"/>
-          <w:kern w:val="0"/>
-          <w:sz w:val="24"/>
-          <w:szCs w:val="24"/>
-        </w:rPr>
-        <w:t>Good (10–12 marks): Suitable opening; thesis is there but a bit general</w:t>
-      </w:r>
-    </w:p>
-    <w:p>
-      <w:pPr>
-        <w:numPr>
-          <w:ilvl w:val="1"/>
-          <w:numId w:val="1"/>
-        </w:numPr>
-        <w:spacing w:before="100" w:beforeAutospacing="1" w:after="100" w:afterAutospacing="1" w:line="240" w:lineRule="auto"/>
-        <w:rPr>
-          <w:rFonts w:ascii="Times New Roman" w:eastAsia="Times New Roman" w:hAnsi="Times New Roman" w:cs="Times New Roman"/>
-          <w:kern w:val="0"/>
-          <w:sz w:val="24"/>
-          <w:szCs w:val="24"/>
-        </w:rPr>
-      </w:pPr>
-      <w:r>
-        <w:rPr>
-          <w:rFonts w:ascii="Times New Roman" w:eastAsia="Times New Roman" w:hAnsi="Times New Roman" w:cs="Times New Roman"/>
-          <w:kern w:val="0"/>
-          <w:sz w:val="24"/>
-          <w:szCs w:val="24"/>
-        </w:rPr>
-        <w:t>Average (6–9 marks): Weak or unclear opening; thesis is only suggested, not directly stated</w:t>
-      </w:r>
-    </w:p>
-    <w:p>
-      <w:pPr>
-        <w:numPr>
-          <w:ilvl w:val="1"/>
-          <w:numId w:val="1"/>
-        </w:numPr>
-        <w:spacing w:before="100" w:beforeAutospacing="1" w:after="100" w:afterAutospacing="1" w:line="240" w:lineRule="auto"/>
-        <w:rPr>
-          <w:rFonts w:ascii="Times New Roman" w:eastAsia="Times New Roman" w:hAnsi="Times New Roman" w:cs="Times New Roman"/>
-          <w:kern w:val="0"/>
-          <w:sz w:val="24"/>
-          <w:szCs w:val="24"/>
-        </w:rPr>
-      </w:pPr>
-      <w:r>
-        <w:rPr>
-          <w:rFonts w:ascii="Times New Roman" w:eastAsia="Times New Roman" w:hAnsi="Times New Roman" w:cs="Times New Roman"/>
-          <w:kern w:val="0"/>
-          <w:sz w:val="24"/>
-          <w:szCs w:val="24"/>
-        </w:rPr>
-        <w:t>Weak (0–5 marks): Off-topic, confusing, or no clear thesis</w:t>
-      </w:r>
-      <w:r>
-        <w:rPr>
-          <w:rFonts w:ascii="Times New Roman" w:eastAsia="Times New Roman" w:hAnsi="Times New Roman" w:cs="Times New Roman"/>
-          <w:kern w:val="0"/>
-          <w:sz w:val="24"/>
-          <w:szCs w:val="24"/>
-        </w:rPr>
-        <w:br/>
-      </w:r>
-    </w:p>
-    <w:p>
-      <w:pPr>
-        <w:spacing w:before="100" w:beforeAutospacing="1" w:after="100" w:afterAutospacing="1" w:line="240" w:lineRule="auto"/>
-        <w:ind w:left="720"/>
+    </w:p>
+    <w:p>
+      <w:pPr>
+        <w:spacing w:before="100" w:beforeAutospacing="1" w:after="100" w:afterAutospacing="1" w:line="240" w:lineRule="auto"/>
         <w:rPr>
           <w:rFonts w:ascii="Times New Roman" w:eastAsia="Times New Roman" w:hAnsi="Times New Roman" w:cs="Times New Roman"/>
           <w:kern w:val="0"/>
@@ -812,15 +1099,6 @@
           <w:sz w:val="24"/>
           <w:szCs w:val="24"/>
         </w:rPr>
-        <w:t xml:space="preserve">Purpose: To make sure the essay sticks strictly to the topic without going off-track, repeating, or adding unnecessary material. </w:t>
-      </w:r>
-      <w:r>
-        <w:rPr>
-          <w:rFonts w:ascii="Times New Roman" w:eastAsia="Times New Roman" w:hAnsi="Times New Roman" w:cs="Times New Roman"/>
-          <w:kern w:val="0"/>
-          <w:sz w:val="24"/>
-          <w:szCs w:val="24"/>
-        </w:rPr>
         <w:br/>
       </w:r>
       <w:r>
@@ -830,23 +1108,24 @@
           <w:sz w:val="24"/>
           <w:szCs w:val="24"/>
         </w:rPr>
-        <w:br/>
-      </w:r>
-      <w:r>
-        <w:rPr>
-          <w:rFonts w:ascii="Times New Roman" w:eastAsia="Times New Roman" w:hAnsi="Times New Roman" w:cs="Times New Roman"/>
-          <w:kern w:val="0"/>
-          <w:sz w:val="24"/>
-          <w:szCs w:val="24"/>
-        </w:rPr>
-        <w:t>Key signs: No extra or overshadowing content; every paragraph supports the thesis; direct answer to the topic title.</w:t>
-      </w:r>
-    </w:p>
-    <w:p>
-      <w:pPr>
+        <w:t>Key indicators</w:t>
+      </w:r>
+      <w:r>
+        <w:rPr>
+          <w:rFonts w:ascii="Times New Roman" w:eastAsia="Times New Roman" w:hAnsi="Times New Roman" w:cs="Times New Roman"/>
+          <w:kern w:val="0"/>
+          <w:sz w:val="24"/>
+          <w:szCs w:val="24"/>
+        </w:rPr>
+        <w:t xml:space="preserve">: </w:t>
+      </w:r>
+    </w:p>
+    <w:p>
+      <w:pPr>
+        <w:pStyle w:val="ListParagraph"/>
         <w:numPr>
-          <w:ilvl w:val="1"/>
-          <w:numId w:val="1"/>
+          <w:ilvl w:val="0"/>
+          <w:numId w:val="3"/>
         </w:numPr>
         <w:spacing w:before="100" w:beforeAutospacing="1" w:after="100" w:afterAutospacing="1" w:line="240" w:lineRule="auto"/>
         <w:rPr>
@@ -863,14 +1142,24 @@
           <w:sz w:val="24"/>
           <w:szCs w:val="24"/>
         </w:rPr>
-        <w:t>Excellent (5 marks): Completely focused and relevant all the way through</w:t>
-      </w:r>
-    </w:p>
-    <w:p>
-      <w:pPr>
+        <w:t>No irrelevant content or arguments in the essay body.</w:t>
+      </w:r>
+      <w:r>
+        <w:rPr>
+          <w:rFonts w:ascii="Times New Roman" w:eastAsia="Times New Roman" w:hAnsi="Times New Roman" w:cs="Times New Roman"/>
+          <w:kern w:val="0"/>
+          <w:sz w:val="24"/>
+          <w:szCs w:val="24"/>
+        </w:rPr>
+        <w:t xml:space="preserve"> </w:t>
+      </w:r>
+    </w:p>
+    <w:p>
+      <w:pPr>
+        <w:pStyle w:val="ListParagraph"/>
         <w:numPr>
-          <w:ilvl w:val="1"/>
-          <w:numId w:val="1"/>
+          <w:ilvl w:val="0"/>
+          <w:numId w:val="3"/>
         </w:numPr>
         <w:spacing w:before="100" w:beforeAutospacing="1" w:after="100" w:afterAutospacing="1" w:line="240" w:lineRule="auto"/>
         <w:rPr>
@@ -887,14 +1176,42 @@
           <w:sz w:val="24"/>
           <w:szCs w:val="24"/>
         </w:rPr>
-        <w:t>Good (4 marks): Very small digressions or slight repetition</w:t>
-      </w:r>
-    </w:p>
-    <w:p>
-      <w:pPr>
+        <w:t>E</w:t>
+      </w:r>
+      <w:r>
+        <w:rPr>
+          <w:rFonts w:ascii="Times New Roman" w:eastAsia="Times New Roman" w:hAnsi="Times New Roman" w:cs="Times New Roman"/>
+          <w:kern w:val="0"/>
+          <w:sz w:val="24"/>
+          <w:szCs w:val="24"/>
+        </w:rPr>
+        <w:t>very paragraph supports the thesis</w:t>
+      </w:r>
+      <w:r>
+        <w:rPr>
+          <w:rFonts w:ascii="Times New Roman" w:eastAsia="Times New Roman" w:hAnsi="Times New Roman" w:cs="Times New Roman"/>
+          <w:kern w:val="0"/>
+          <w:sz w:val="24"/>
+          <w:szCs w:val="24"/>
+        </w:rPr>
+        <w:t xml:space="preserve"> or the stance the student took</w:t>
+      </w:r>
+      <w:r>
+        <w:rPr>
+          <w:rFonts w:ascii="Times New Roman" w:eastAsia="Times New Roman" w:hAnsi="Times New Roman" w:cs="Times New Roman"/>
+          <w:kern w:val="0"/>
+          <w:sz w:val="24"/>
+          <w:szCs w:val="24"/>
+        </w:rPr>
+        <w:t xml:space="preserve">; </w:t>
+      </w:r>
+    </w:p>
+    <w:p>
+      <w:pPr>
+        <w:pStyle w:val="ListParagraph"/>
         <w:numPr>
-          <w:ilvl w:val="1"/>
-          <w:numId w:val="1"/>
+          <w:ilvl w:val="0"/>
+          <w:numId w:val="3"/>
         </w:numPr>
         <w:spacing w:before="100" w:beforeAutospacing="1" w:after="100" w:afterAutospacing="1" w:line="240" w:lineRule="auto"/>
         <w:rPr>
@@ -911,37 +1228,21 @@
           <w:sz w:val="24"/>
           <w:szCs w:val="24"/>
         </w:rPr>
-        <w:t>Average (2–3 marks): Some off-topic parts or irrelevant material</w:t>
-      </w:r>
-    </w:p>
-    <w:p>
-      <w:pPr>
-        <w:numPr>
-          <w:ilvl w:val="1"/>
-          <w:numId w:val="1"/>
-        </w:numPr>
-        <w:spacing w:before="100" w:beforeAutospacing="1" w:after="100" w:afterAutospacing="1" w:line="240" w:lineRule="auto"/>
-        <w:rPr>
-          <w:rFonts w:ascii="Times New Roman" w:eastAsia="Times New Roman" w:hAnsi="Times New Roman" w:cs="Times New Roman"/>
-          <w:kern w:val="0"/>
-          <w:sz w:val="24"/>
-          <w:szCs w:val="24"/>
-        </w:rPr>
-      </w:pPr>
-      <w:r>
-        <w:rPr>
-          <w:rFonts w:ascii="Times New Roman" w:eastAsia="Times New Roman" w:hAnsi="Times New Roman" w:cs="Times New Roman"/>
-          <w:kern w:val="0"/>
-          <w:sz w:val="24"/>
-          <w:szCs w:val="24"/>
-        </w:rPr>
-        <w:t>Weak (0–1 mark): Often off-topic, irrelevant, or full of common repeated ideas</w:t>
-      </w:r>
-    </w:p>
-    <w:p>
-      <w:pPr>
-        <w:spacing w:before="100" w:beforeAutospacing="1" w:after="100" w:afterAutospacing="1" w:line="240" w:lineRule="auto"/>
-        <w:ind w:left="720"/>
+        <w:t>Each paragraph answers directly to the essay prompt</w:t>
+      </w:r>
+      <w:r>
+        <w:rPr>
+          <w:rFonts w:ascii="Times New Roman" w:eastAsia="Times New Roman" w:hAnsi="Times New Roman" w:cs="Times New Roman"/>
+          <w:kern w:val="0"/>
+          <w:sz w:val="24"/>
+          <w:szCs w:val="24"/>
+        </w:rPr>
+        <w:t>.</w:t>
+      </w:r>
+    </w:p>
+    <w:p>
+      <w:pPr>
+        <w:spacing w:before="100" w:beforeAutospacing="1" w:after="100" w:afterAutospacing="1" w:line="240" w:lineRule="auto"/>
         <w:rPr>
           <w:rFonts w:ascii="Times New Roman" w:eastAsia="Times New Roman" w:hAnsi="Times New Roman" w:cs="Times New Roman"/>
           <w:kern w:val="0"/>
@@ -958,7 +1259,7 @@
           <w:sz w:val="24"/>
           <w:szCs w:val="24"/>
         </w:rPr>
-        <w:t>4. Content Depth &amp; Originality (10 Marks)</w:t>
+        <w:t xml:space="preserve">4. </w:t>
       </w:r>
       <w:r>
         <w:rPr>
@@ -969,8 +1270,9 @@
           <w:sz w:val="24"/>
           <w:szCs w:val="24"/>
         </w:rPr>
-        <w:br/>
-      </w:r>
+        <w:t>Content Depth &amp; Originality (10 Marks</w:t>
+      </w:r>
+      <w:proofErr w:type="gramStart"/>
       <w:r>
         <w:rPr>
           <w:rFonts w:ascii="Times New Roman" w:eastAsia="Times New Roman" w:hAnsi="Times New Roman" w:cs="Times New Roman"/>
@@ -980,6 +1282,16 @@
           <w:sz w:val="24"/>
           <w:szCs w:val="24"/>
         </w:rPr>
+        <w:t>)</w:t>
+      </w:r>
+      <w:proofErr w:type="gramEnd"/>
+      <w:r>
+        <w:rPr>
+          <w:rFonts w:ascii="Times New Roman" w:eastAsia="Times New Roman" w:hAnsi="Times New Roman" w:cs="Times New Roman"/>
+          <w:kern w:val="0"/>
+          <w:sz w:val="24"/>
+          <w:szCs w:val="24"/>
+        </w:rPr>
         <w:br/>
       </w:r>
       <w:r>
@@ -989,78 +1301,25 @@
           <w:sz w:val="24"/>
           <w:szCs w:val="24"/>
         </w:rPr>
-        <w:t xml:space="preserve"> Purpose: To check deep research-based knowledge mixed with personal and original thinking (not just memorized or bookish material). </w:t>
-      </w:r>
-      <w:r>
-        <w:rPr>
-          <w:rFonts w:ascii="Times New Roman" w:eastAsia="Times New Roman" w:hAnsi="Times New Roman" w:cs="Times New Roman"/>
-          <w:kern w:val="0"/>
-          <w:sz w:val="24"/>
-          <w:szCs w:val="24"/>
-        </w:rPr>
         <w:br/>
-      </w:r>
-      <w:r>
-        <w:rPr>
-          <w:rFonts w:ascii="Times New Roman" w:eastAsia="Times New Roman" w:hAnsi="Times New Roman" w:cs="Times New Roman"/>
-          <w:kern w:val="0"/>
-          <w:sz w:val="24"/>
-          <w:szCs w:val="24"/>
-        </w:rPr>
-        <w:br/>
-        <w:t>Key signs: Relevant ideas; no crammed</w:t>
-      </w:r>
-      <w:r>
-        <w:rPr>
-          <w:rFonts w:ascii="Times New Roman" w:eastAsia="Times New Roman" w:hAnsi="Times New Roman" w:cs="Times New Roman"/>
-          <w:kern w:val="0"/>
-          <w:sz w:val="24"/>
-          <w:szCs w:val="24"/>
-        </w:rPr>
-        <w:t xml:space="preserve"> content; facts or evidenc</w:t>
-      </w:r>
-      <w:r>
-        <w:rPr>
-          <w:rFonts w:ascii="Times New Roman" w:eastAsia="Times New Roman" w:hAnsi="Times New Roman" w:cs="Times New Roman"/>
-          <w:kern w:val="0"/>
-          <w:sz w:val="24"/>
-          <w:szCs w:val="24"/>
-        </w:rPr>
-        <w:t>e where required; originality of</w:t>
-      </w:r>
-      <w:r>
-        <w:rPr>
-          <w:rFonts w:ascii="Times New Roman" w:eastAsia="Times New Roman" w:hAnsi="Times New Roman" w:cs="Times New Roman"/>
-          <w:kern w:val="0"/>
-          <w:sz w:val="24"/>
-          <w:szCs w:val="24"/>
-        </w:rPr>
-        <w:t xml:space="preserve"> thoughts; av</w:t>
-      </w:r>
-      <w:r>
-        <w:rPr>
-          <w:rFonts w:ascii="Times New Roman" w:eastAsia="Times New Roman" w:hAnsi="Times New Roman" w:cs="Times New Roman"/>
-          <w:kern w:val="0"/>
-          <w:sz w:val="24"/>
-          <w:szCs w:val="24"/>
-        </w:rPr>
-        <w:t xml:space="preserve">oids shallow or superficial </w:t>
-      </w:r>
-      <w:r>
-        <w:rPr>
-          <w:rFonts w:ascii="Times New Roman" w:eastAsia="Times New Roman" w:hAnsi="Times New Roman" w:cs="Times New Roman"/>
-          <w:kern w:val="0"/>
-          <w:sz w:val="24"/>
-          <w:szCs w:val="24"/>
-        </w:rPr>
-        <w:t>information.</w:t>
-      </w:r>
-    </w:p>
-    <w:p>
-      <w:pPr>
+        <w:t>Key indicators</w:t>
+      </w:r>
+      <w:r>
+        <w:rPr>
+          <w:rFonts w:ascii="Times New Roman" w:eastAsia="Times New Roman" w:hAnsi="Times New Roman" w:cs="Times New Roman"/>
+          <w:kern w:val="0"/>
+          <w:sz w:val="24"/>
+          <w:szCs w:val="24"/>
+        </w:rPr>
+        <w:t xml:space="preserve">: </w:t>
+      </w:r>
+    </w:p>
+    <w:p>
+      <w:pPr>
+        <w:pStyle w:val="ListParagraph"/>
         <w:numPr>
-          <w:ilvl w:val="1"/>
-          <w:numId w:val="1"/>
+          <w:ilvl w:val="0"/>
+          <w:numId w:val="4"/>
         </w:numPr>
         <w:spacing w:before="100" w:beforeAutospacing="1" w:after="100" w:afterAutospacing="1" w:line="240" w:lineRule="auto"/>
         <w:rPr>
@@ -1077,14 +1336,42 @@
           <w:sz w:val="24"/>
           <w:szCs w:val="24"/>
         </w:rPr>
-        <w:t>Excellent (9–10 marks): Deep and original ideas with suitable supporting material</w:t>
-      </w:r>
-    </w:p>
-    <w:p>
-      <w:pPr>
+        <w:t>Ideas and arguments presented in the essay</w:t>
+      </w:r>
+      <w:r>
+        <w:rPr>
+          <w:rFonts w:ascii="Times New Roman" w:eastAsia="Times New Roman" w:hAnsi="Times New Roman" w:cs="Times New Roman"/>
+          <w:kern w:val="0"/>
+          <w:sz w:val="24"/>
+          <w:szCs w:val="24"/>
+        </w:rPr>
+        <w:t xml:space="preserve"> body</w:t>
+      </w:r>
+      <w:r>
+        <w:rPr>
+          <w:rFonts w:ascii="Times New Roman" w:eastAsia="Times New Roman" w:hAnsi="Times New Roman" w:cs="Times New Roman"/>
+          <w:kern w:val="0"/>
+          <w:sz w:val="24"/>
+          <w:szCs w:val="24"/>
+        </w:rPr>
+        <w:t xml:space="preserve"> should be relevant and original.</w:t>
+      </w:r>
+      <w:r>
+        <w:rPr>
+          <w:rFonts w:ascii="Times New Roman" w:eastAsia="Times New Roman" w:hAnsi="Times New Roman" w:cs="Times New Roman"/>
+          <w:kern w:val="0"/>
+          <w:sz w:val="24"/>
+          <w:szCs w:val="24"/>
+        </w:rPr>
+        <w:t xml:space="preserve"> </w:t>
+      </w:r>
+    </w:p>
+    <w:p>
+      <w:pPr>
+        <w:pStyle w:val="ListParagraph"/>
         <w:numPr>
-          <w:ilvl w:val="1"/>
-          <w:numId w:val="1"/>
+          <w:ilvl w:val="0"/>
+          <w:numId w:val="4"/>
         </w:numPr>
         <w:spacing w:before="100" w:beforeAutospacing="1" w:after="100" w:afterAutospacing="1" w:line="240" w:lineRule="auto"/>
         <w:rPr>
@@ -1101,14 +1388,33 @@
           <w:sz w:val="24"/>
           <w:szCs w:val="24"/>
         </w:rPr>
-        <w:t>Good (7–8 marks): Fair depth; some personal thinking but sometimes uses common phrases</w:t>
-      </w:r>
-    </w:p>
-    <w:p>
-      <w:pPr>
+        <w:t>There should be n</w:t>
+      </w:r>
+      <w:r>
+        <w:rPr>
+          <w:rFonts w:ascii="Times New Roman" w:eastAsia="Times New Roman" w:hAnsi="Times New Roman" w:cs="Times New Roman"/>
+          <w:kern w:val="0"/>
+          <w:sz w:val="24"/>
+          <w:szCs w:val="24"/>
+        </w:rPr>
+        <w:t>o crammed</w:t>
+      </w:r>
+      <w:r>
+        <w:rPr>
+          <w:rFonts w:ascii="Times New Roman" w:eastAsia="Times New Roman" w:hAnsi="Times New Roman" w:cs="Times New Roman"/>
+          <w:kern w:val="0"/>
+          <w:sz w:val="24"/>
+          <w:szCs w:val="24"/>
+        </w:rPr>
+        <w:t xml:space="preserve"> content.</w:t>
+      </w:r>
+    </w:p>
+    <w:p>
+      <w:pPr>
+        <w:pStyle w:val="ListParagraph"/>
         <w:numPr>
-          <w:ilvl w:val="1"/>
-          <w:numId w:val="1"/>
+          <w:ilvl w:val="0"/>
+          <w:numId w:val="4"/>
         </w:numPr>
         <w:spacing w:before="100" w:beforeAutospacing="1" w:after="100" w:afterAutospacing="1" w:line="240" w:lineRule="auto"/>
         <w:rPr>
@@ -1125,14 +1431,24 @@
           <w:sz w:val="24"/>
           <w:szCs w:val="24"/>
         </w:rPr>
-        <w:t>Average (4–6 marks): Surface-level or mostly memorized/repeated ideas</w:t>
-      </w:r>
-    </w:p>
-    <w:p>
-      <w:pPr>
+        <w:t>Each argument must be backed by f</w:t>
+      </w:r>
+      <w:r>
+        <w:rPr>
+          <w:rFonts w:ascii="Times New Roman" w:eastAsia="Times New Roman" w:hAnsi="Times New Roman" w:cs="Times New Roman"/>
+          <w:kern w:val="0"/>
+          <w:sz w:val="24"/>
+          <w:szCs w:val="24"/>
+        </w:rPr>
+        <w:t xml:space="preserve">acts or evidence where required; </w:t>
+      </w:r>
+    </w:p>
+    <w:p>
+      <w:pPr>
+        <w:pStyle w:val="ListParagraph"/>
         <w:numPr>
-          <w:ilvl w:val="1"/>
-          <w:numId w:val="1"/>
+          <w:ilvl w:val="0"/>
+          <w:numId w:val="4"/>
         </w:numPr>
         <w:spacing w:before="100" w:beforeAutospacing="1" w:after="100" w:afterAutospacing="1" w:line="240" w:lineRule="auto"/>
         <w:rPr>
@@ -1149,13 +1465,21 @@
           <w:sz w:val="24"/>
           <w:szCs w:val="24"/>
         </w:rPr>
-        <w:t>Weak (0–3 marks): Shallow, irrelevant, or completely common repeated content</w:t>
-      </w:r>
-    </w:p>
-    <w:p>
-      <w:pPr>
-        <w:spacing w:before="100" w:beforeAutospacing="1" w:after="100" w:afterAutospacing="1" w:line="240" w:lineRule="auto"/>
-        <w:ind w:left="720"/>
+        <w:t>Avoidance of</w:t>
+      </w:r>
+      <w:r>
+        <w:rPr>
+          <w:rFonts w:ascii="Times New Roman" w:eastAsia="Times New Roman" w:hAnsi="Times New Roman" w:cs="Times New Roman"/>
+          <w:kern w:val="0"/>
+          <w:sz w:val="24"/>
+          <w:szCs w:val="24"/>
+        </w:rPr>
+        <w:t xml:space="preserve"> shallow or superficial information.</w:t>
+      </w:r>
+    </w:p>
+    <w:p>
+      <w:pPr>
+        <w:spacing w:before="100" w:beforeAutospacing="1" w:after="100" w:afterAutospacing="1" w:line="240" w:lineRule="auto"/>
         <w:rPr>
           <w:rFonts w:ascii="Times New Roman" w:eastAsia="Times New Roman" w:hAnsi="Times New Roman" w:cs="Times New Roman"/>
           <w:kern w:val="0"/>
@@ -1208,15 +1532,6 @@
           <w:sz w:val="24"/>
           <w:szCs w:val="24"/>
         </w:rPr>
-        <w:t xml:space="preserve">Purpose: To test the ability to build logical, balanced, and critical arguments instead of just describing or narrating. </w:t>
-      </w:r>
-      <w:r>
-        <w:rPr>
-          <w:rFonts w:ascii="Times New Roman" w:eastAsia="Times New Roman" w:hAnsi="Times New Roman" w:cs="Times New Roman"/>
-          <w:kern w:val="0"/>
-          <w:sz w:val="24"/>
-          <w:szCs w:val="24"/>
-        </w:rPr>
         <w:br/>
       </w:r>
       <w:r>
@@ -1226,25 +1541,100 @@
           <w:sz w:val="24"/>
           <w:szCs w:val="24"/>
         </w:rPr>
-        <w:br/>
-      </w:r>
-      <w:r>
-        <w:rPr>
-          <w:rFonts w:ascii="Times New Roman" w:eastAsia="Times New Roman" w:hAnsi="Times New Roman" w:cs="Times New Roman"/>
-          <w:kern w:val="0"/>
-          <w:sz w:val="24"/>
-          <w:szCs w:val="24"/>
-        </w:rPr>
-        <w:t>Key signs: Logical thinking; clear person</w:t>
-      </w:r>
-      <w:r>
-        <w:rPr>
-          <w:rFonts w:ascii="Times New Roman" w:eastAsia="Times New Roman" w:hAnsi="Times New Roman" w:cs="Times New Roman"/>
-          <w:kern w:val="0"/>
-          <w:sz w:val="24"/>
-          <w:szCs w:val="24"/>
-        </w:rPr>
-        <w:t>al position; addresses counter views; evaluates evidence; analytical analysis</w:t>
+        <w:t>Key indicators</w:t>
+      </w:r>
+      <w:r>
+        <w:rPr>
+          <w:rFonts w:ascii="Times New Roman" w:eastAsia="Times New Roman" w:hAnsi="Times New Roman" w:cs="Times New Roman"/>
+          <w:kern w:val="0"/>
+          <w:sz w:val="24"/>
+          <w:szCs w:val="24"/>
+        </w:rPr>
+        <w:t xml:space="preserve">: </w:t>
+      </w:r>
+    </w:p>
+    <w:p>
+      <w:pPr>
+        <w:pStyle w:val="ListParagraph"/>
+        <w:numPr>
+          <w:ilvl w:val="0"/>
+          <w:numId w:val="5"/>
+        </w:numPr>
+        <w:spacing w:before="100" w:beforeAutospacing="1" w:after="100" w:afterAutospacing="1" w:line="240" w:lineRule="auto"/>
+        <w:rPr>
+          <w:rFonts w:ascii="Times New Roman" w:eastAsia="Times New Roman" w:hAnsi="Times New Roman" w:cs="Times New Roman"/>
+          <w:kern w:val="0"/>
+          <w:sz w:val="24"/>
+          <w:szCs w:val="24"/>
+        </w:rPr>
+      </w:pPr>
+      <w:r>
+        <w:rPr>
+          <w:rFonts w:ascii="Times New Roman" w:eastAsia="Times New Roman" w:hAnsi="Times New Roman" w:cs="Times New Roman"/>
+          <w:kern w:val="0"/>
+          <w:sz w:val="24"/>
+          <w:szCs w:val="24"/>
+        </w:rPr>
+        <w:t>Arguments should be based on logical thinking and must be backed by evidence.</w:t>
+      </w:r>
+    </w:p>
+    <w:p>
+      <w:pPr>
+        <w:pStyle w:val="ListParagraph"/>
+        <w:numPr>
+          <w:ilvl w:val="0"/>
+          <w:numId w:val="5"/>
+        </w:numPr>
+        <w:spacing w:before="100" w:beforeAutospacing="1" w:after="100" w:afterAutospacing="1" w:line="240" w:lineRule="auto"/>
+        <w:rPr>
+          <w:rFonts w:ascii="Times New Roman" w:eastAsia="Times New Roman" w:hAnsi="Times New Roman" w:cs="Times New Roman"/>
+          <w:kern w:val="0"/>
+          <w:sz w:val="24"/>
+          <w:szCs w:val="24"/>
+        </w:rPr>
+      </w:pPr>
+      <w:r>
+        <w:rPr>
+          <w:rFonts w:ascii="Times New Roman" w:eastAsia="Times New Roman" w:hAnsi="Times New Roman" w:cs="Times New Roman"/>
+          <w:kern w:val="0"/>
+          <w:sz w:val="24"/>
+          <w:szCs w:val="24"/>
+        </w:rPr>
+        <w:t>Counter perspective must be present to give essay a critical outlook.</w:t>
+      </w:r>
+      <w:r>
+        <w:rPr>
+          <w:rFonts w:ascii="Times New Roman" w:eastAsia="Times New Roman" w:hAnsi="Times New Roman" w:cs="Times New Roman"/>
+          <w:kern w:val="0"/>
+          <w:sz w:val="24"/>
+          <w:szCs w:val="24"/>
+        </w:rPr>
+        <w:t xml:space="preserve"> </w:t>
+      </w:r>
+    </w:p>
+    <w:p>
+      <w:pPr>
+        <w:pStyle w:val="ListParagraph"/>
+        <w:numPr>
+          <w:ilvl w:val="0"/>
+          <w:numId w:val="5"/>
+        </w:numPr>
+        <w:spacing w:before="100" w:beforeAutospacing="1" w:after="100" w:afterAutospacing="1" w:line="240" w:lineRule="auto"/>
+        <w:rPr>
+          <w:rFonts w:ascii="Times New Roman" w:eastAsia="Times New Roman" w:hAnsi="Times New Roman" w:cs="Times New Roman"/>
+          <w:kern w:val="0"/>
+          <w:sz w:val="24"/>
+          <w:szCs w:val="24"/>
+        </w:rPr>
+      </w:pPr>
+      <w:r>
+        <w:rPr>
+          <w:rFonts w:ascii="Times New Roman" w:eastAsia="Times New Roman" w:hAnsi="Times New Roman" w:cs="Times New Roman"/>
+          <w:kern w:val="0"/>
+          <w:sz w:val="24"/>
+          <w:szCs w:val="24"/>
+        </w:rPr>
+        <w:t>Arguments must reflect student’s ability to analyze analytically</w:t>
       </w:r>
       <w:r>
         <w:rPr>
@@ -1258,105 +1648,7 @@
     </w:p>
     <w:p>
       <w:pPr>
-        <w:numPr>
-          <w:ilvl w:val="1"/>
-          <w:numId w:val="1"/>
-        </w:numPr>
-        <w:spacing w:before="100" w:beforeAutospacing="1" w:after="100" w:afterAutospacing="1" w:line="240" w:lineRule="auto"/>
-        <w:rPr>
-          <w:rFonts w:ascii="Times New Roman" w:eastAsia="Times New Roman" w:hAnsi="Times New Roman" w:cs="Times New Roman"/>
-          <w:kern w:val="0"/>
-          <w:sz w:val="24"/>
-          <w:szCs w:val="24"/>
-        </w:rPr>
-      </w:pPr>
-      <w:r>
-        <w:rPr>
-          <w:rFonts w:ascii="Times New Roman" w:eastAsia="Times New Roman" w:hAnsi="Times New Roman" w:cs="Times New Roman"/>
-          <w:kern w:val="0"/>
-          <w:sz w:val="24"/>
-          <w:szCs w:val="24"/>
-        </w:rPr>
-        <w:t>Excellent (9–10 marks): Careful, balanced, and convincing critical analysis with counter-arguments</w:t>
-      </w:r>
-    </w:p>
-    <w:p>
-      <w:pPr>
-        <w:numPr>
-          <w:ilvl w:val="1"/>
-          <w:numId w:val="1"/>
-        </w:numPr>
-        <w:spacing w:before="100" w:beforeAutospacing="1" w:after="100" w:afterAutospacing="1" w:line="240" w:lineRule="auto"/>
-        <w:rPr>
-          <w:rFonts w:ascii="Times New Roman" w:eastAsia="Times New Roman" w:hAnsi="Times New Roman" w:cs="Times New Roman"/>
-          <w:kern w:val="0"/>
-          <w:sz w:val="24"/>
-          <w:szCs w:val="24"/>
-        </w:rPr>
-      </w:pPr>
-      <w:r>
-        <w:rPr>
-          <w:rFonts w:ascii="Times New Roman" w:eastAsia="Times New Roman" w:hAnsi="Times New Roman" w:cs="Times New Roman"/>
-          <w:kern w:val="0"/>
-          <w:sz w:val="24"/>
-          <w:szCs w:val="24"/>
-        </w:rPr>
-        <w:t>Good (7–8 marks): Good arguments but uneven depth or limited handling of opposite views</w:t>
-      </w:r>
-    </w:p>
-    <w:p>
-      <w:pPr>
-        <w:numPr>
-          <w:ilvl w:val="1"/>
-          <w:numId w:val="1"/>
-        </w:numPr>
-        <w:spacing w:before="100" w:beforeAutospacing="1" w:after="100" w:afterAutospacing="1" w:line="240" w:lineRule="auto"/>
-        <w:rPr>
-          <w:rFonts w:ascii="Times New Roman" w:eastAsia="Times New Roman" w:hAnsi="Times New Roman" w:cs="Times New Roman"/>
-          <w:kern w:val="0"/>
-          <w:sz w:val="24"/>
-          <w:szCs w:val="24"/>
-        </w:rPr>
-      </w:pPr>
-      <w:r>
-        <w:rPr>
-          <w:rFonts w:ascii="Times New Roman" w:eastAsia="Times New Roman" w:hAnsi="Times New Roman" w:cs="Times New Roman"/>
-          <w:kern w:val="0"/>
-          <w:sz w:val="24"/>
-          <w:szCs w:val="24"/>
-        </w:rPr>
-        <w:lastRenderedPageBreak/>
-        <w:t>Average (4–6 marks): Mostly describing; weak reasoning or no counter-views</w:t>
-      </w:r>
-    </w:p>
-    <w:p>
-      <w:pPr>
-        <w:numPr>
-          <w:ilvl w:val="1"/>
-          <w:numId w:val="1"/>
-        </w:numPr>
-        <w:spacing w:before="100" w:beforeAutospacing="1" w:after="100" w:afterAutospacing="1" w:line="240" w:lineRule="auto"/>
-        <w:rPr>
-          <w:rFonts w:ascii="Times New Roman" w:eastAsia="Times New Roman" w:hAnsi="Times New Roman" w:cs="Times New Roman"/>
-          <w:kern w:val="0"/>
-          <w:sz w:val="24"/>
-          <w:szCs w:val="24"/>
-        </w:rPr>
-      </w:pPr>
-      <w:r>
-        <w:rPr>
-          <w:rFonts w:ascii="Times New Roman" w:eastAsia="Times New Roman" w:hAnsi="Times New Roman" w:cs="Times New Roman"/>
-          <w:kern w:val="0"/>
-          <w:sz w:val="24"/>
-          <w:szCs w:val="24"/>
-        </w:rPr>
-        <w:t>Weak (0–3 marks): No logical argument; scattered ideas or only narration</w:t>
-      </w:r>
-    </w:p>
-    <w:p>
-      <w:pPr>
-        <w:spacing w:before="100" w:beforeAutospacing="1" w:after="100" w:afterAutospacing="1" w:line="240" w:lineRule="auto"/>
-        <w:ind w:left="720"/>
+        <w:spacing w:before="100" w:beforeAutospacing="1" w:after="100" w:afterAutospacing="1" w:line="240" w:lineRule="auto"/>
         <w:rPr>
           <w:rFonts w:ascii="Times New Roman" w:eastAsia="Times New Roman" w:hAnsi="Times New Roman" w:cs="Times New Roman"/>
           <w:kern w:val="0"/>
@@ -1401,86 +1693,24 @@
           <w:szCs w:val="24"/>
         </w:rPr>
         <w:br/>
-      </w:r>
-      <w:r>
-        <w:rPr>
-          <w:rFonts w:ascii="Times New Roman" w:eastAsia="Times New Roman" w:hAnsi="Times New Roman" w:cs="Times New Roman"/>
-          <w:kern w:val="0"/>
-          <w:sz w:val="24"/>
-          <w:szCs w:val="24"/>
-        </w:rPr>
-        <w:t xml:space="preserve">Purpose: To check logical flow, unity of paragraphs, and smooth connections. </w:t>
-      </w:r>
-      <w:r>
-        <w:rPr>
-          <w:rFonts w:ascii="Times New Roman" w:eastAsia="Times New Roman" w:hAnsi="Times New Roman" w:cs="Times New Roman"/>
-          <w:kern w:val="0"/>
-          <w:sz w:val="24"/>
-          <w:szCs w:val="24"/>
-        </w:rPr>
-        <w:br/>
-      </w:r>
-      <w:r>
-        <w:rPr>
-          <w:rFonts w:ascii="Times New Roman" w:eastAsia="Times New Roman" w:hAnsi="Times New Roman" w:cs="Times New Roman"/>
-          <w:kern w:val="0"/>
-          <w:sz w:val="24"/>
-          <w:szCs w:val="24"/>
-        </w:rPr>
-        <w:br/>
-        <w:t>Key signs: Coherence</w:t>
-      </w:r>
-      <w:r>
-        <w:rPr>
-          <w:rFonts w:ascii="Times New Roman" w:eastAsia="Times New Roman" w:hAnsi="Times New Roman" w:cs="Times New Roman"/>
-          <w:kern w:val="0"/>
-          <w:sz w:val="24"/>
-          <w:szCs w:val="24"/>
-        </w:rPr>
-        <w:t xml:space="preserve"> between all parts of th</w:t>
-      </w:r>
-      <w:r>
-        <w:rPr>
-          <w:rFonts w:ascii="Times New Roman" w:eastAsia="Times New Roman" w:hAnsi="Times New Roman" w:cs="Times New Roman"/>
-          <w:kern w:val="0"/>
-          <w:sz w:val="24"/>
-          <w:szCs w:val="24"/>
-        </w:rPr>
-        <w:t>e essay; smooth transitions; cohesive</w:t>
-      </w:r>
-      <w:r>
-        <w:rPr>
-          <w:rFonts w:ascii="Times New Roman" w:eastAsia="Times New Roman" w:hAnsi="Times New Roman" w:cs="Times New Roman"/>
-          <w:kern w:val="0"/>
-          <w:sz w:val="24"/>
-          <w:szCs w:val="24"/>
-        </w:rPr>
-        <w:t xml:space="preserve"> paragraphs; feels like one complete piece</w:t>
-      </w:r>
-      <w:r>
-        <w:rPr>
-          <w:rFonts w:ascii="Times New Roman" w:eastAsia="Times New Roman" w:hAnsi="Times New Roman" w:cs="Times New Roman"/>
-          <w:kern w:val="0"/>
-          <w:sz w:val="24"/>
-          <w:szCs w:val="24"/>
-        </w:rPr>
-        <w:t xml:space="preserve"> of writing</w:t>
-      </w:r>
-      <w:r>
-        <w:rPr>
-          <w:rFonts w:ascii="Times New Roman" w:eastAsia="Times New Roman" w:hAnsi="Times New Roman" w:cs="Times New Roman"/>
-          <w:kern w:val="0"/>
-          <w:sz w:val="24"/>
-          <w:szCs w:val="24"/>
-        </w:rPr>
-        <w:t>; no broken sections.</w:t>
-      </w:r>
-    </w:p>
-    <w:p>
-      <w:pPr>
+        <w:t>Key indicators</w:t>
+      </w:r>
+      <w:r>
+        <w:rPr>
+          <w:rFonts w:ascii="Times New Roman" w:eastAsia="Times New Roman" w:hAnsi="Times New Roman" w:cs="Times New Roman"/>
+          <w:kern w:val="0"/>
+          <w:sz w:val="24"/>
+          <w:szCs w:val="24"/>
+        </w:rPr>
+        <w:t xml:space="preserve">: </w:t>
+      </w:r>
+    </w:p>
+    <w:p>
+      <w:pPr>
+        <w:pStyle w:val="ListParagraph"/>
         <w:numPr>
-          <w:ilvl w:val="1"/>
-          <w:numId w:val="1"/>
+          <w:ilvl w:val="0"/>
+          <w:numId w:val="6"/>
         </w:numPr>
         <w:spacing w:before="100" w:beforeAutospacing="1" w:after="100" w:afterAutospacing="1" w:line="240" w:lineRule="auto"/>
         <w:rPr>
@@ -1497,14 +1727,42 @@
           <w:sz w:val="24"/>
           <w:szCs w:val="24"/>
         </w:rPr>
-        <w:t>Excellent (5 marks): Perfect flow with strong connections and full unity</w:t>
-      </w:r>
-    </w:p>
-    <w:p>
-      <w:pPr>
+        <w:t>There should be c</w:t>
+      </w:r>
+      <w:r>
+        <w:rPr>
+          <w:rFonts w:ascii="Times New Roman" w:eastAsia="Times New Roman" w:hAnsi="Times New Roman" w:cs="Times New Roman"/>
+          <w:kern w:val="0"/>
+          <w:sz w:val="24"/>
+          <w:szCs w:val="24"/>
+        </w:rPr>
+        <w:t>oherence between all parts of th</w:t>
+      </w:r>
+      <w:r>
+        <w:rPr>
+          <w:rFonts w:ascii="Times New Roman" w:eastAsia="Times New Roman" w:hAnsi="Times New Roman" w:cs="Times New Roman"/>
+          <w:kern w:val="0"/>
+          <w:sz w:val="24"/>
+          <w:szCs w:val="24"/>
+        </w:rPr>
+        <w:t>e essay with smooth transitions.</w:t>
+      </w:r>
+      <w:r>
+        <w:rPr>
+          <w:rFonts w:ascii="Times New Roman" w:eastAsia="Times New Roman" w:hAnsi="Times New Roman" w:cs="Times New Roman"/>
+          <w:kern w:val="0"/>
+          <w:sz w:val="24"/>
+          <w:szCs w:val="24"/>
+        </w:rPr>
+        <w:t xml:space="preserve"> </w:t>
+      </w:r>
+    </w:p>
+    <w:p>
+      <w:pPr>
+        <w:pStyle w:val="ListParagraph"/>
         <w:numPr>
-          <w:ilvl w:val="1"/>
-          <w:numId w:val="1"/>
+          <w:ilvl w:val="0"/>
+          <w:numId w:val="6"/>
         </w:numPr>
         <w:spacing w:before="100" w:beforeAutospacing="1" w:after="100" w:afterAutospacing="1" w:line="240" w:lineRule="auto"/>
         <w:rPr>
@@ -1521,14 +1779,24 @@
           <w:sz w:val="24"/>
           <w:szCs w:val="24"/>
         </w:rPr>
-        <w:t>Good (4 marks): Mostly connected with small jumps or repetition</w:t>
-      </w:r>
-    </w:p>
-    <w:p>
-      <w:pPr>
+        <w:t>Paragraphs should be cohesive.</w:t>
+      </w:r>
+      <w:r>
+        <w:rPr>
+          <w:rFonts w:ascii="Times New Roman" w:eastAsia="Times New Roman" w:hAnsi="Times New Roman" w:cs="Times New Roman"/>
+          <w:kern w:val="0"/>
+          <w:sz w:val="24"/>
+          <w:szCs w:val="24"/>
+        </w:rPr>
+        <w:t xml:space="preserve"> </w:t>
+      </w:r>
+    </w:p>
+    <w:p>
+      <w:pPr>
+        <w:pStyle w:val="ListParagraph"/>
         <w:numPr>
-          <w:ilvl w:val="1"/>
-          <w:numId w:val="1"/>
+          <w:ilvl w:val="0"/>
+          <w:numId w:val="6"/>
         </w:numPr>
         <w:spacing w:before="100" w:beforeAutospacing="1" w:after="100" w:afterAutospacing="1" w:line="240" w:lineRule="auto"/>
         <w:rPr>
@@ -1545,14 +1813,24 @@
           <w:sz w:val="24"/>
           <w:szCs w:val="24"/>
         </w:rPr>
-        <w:t>Average (2–3 marks): Some disorder or weak connections</w:t>
-      </w:r>
-    </w:p>
-    <w:p>
-      <w:pPr>
+        <w:t>Essay should feel</w:t>
+      </w:r>
+      <w:r>
+        <w:rPr>
+          <w:rFonts w:ascii="Times New Roman" w:eastAsia="Times New Roman" w:hAnsi="Times New Roman" w:cs="Times New Roman"/>
+          <w:kern w:val="0"/>
+          <w:sz w:val="24"/>
+          <w:szCs w:val="24"/>
+        </w:rPr>
+        <w:t xml:space="preserve"> like one complete piece of writing; </w:t>
+      </w:r>
+    </w:p>
+    <w:p>
+      <w:pPr>
+        <w:pStyle w:val="ListParagraph"/>
         <w:numPr>
-          <w:ilvl w:val="1"/>
-          <w:numId w:val="1"/>
+          <w:ilvl w:val="0"/>
+          <w:numId w:val="6"/>
         </w:numPr>
         <w:spacing w:before="100" w:beforeAutospacing="1" w:after="100" w:afterAutospacing="1" w:line="240" w:lineRule="auto"/>
         <w:rPr>
@@ -1569,13 +1847,39 @@
           <w:sz w:val="24"/>
           <w:szCs w:val="24"/>
         </w:rPr>
-        <w:t>Weak (0–1 mark): Broken paragraphs with poor or missing links</w:t>
-      </w:r>
-    </w:p>
-    <w:p>
-      <w:pPr>
-        <w:spacing w:before="100" w:beforeAutospacing="1" w:after="100" w:afterAutospacing="1" w:line="240" w:lineRule="auto"/>
-        <w:ind w:left="720"/>
+        <w:t xml:space="preserve">There must be </w:t>
+      </w:r>
+      <w:r>
+        <w:rPr>
+          <w:rFonts w:ascii="Times New Roman" w:eastAsia="Times New Roman" w:hAnsi="Times New Roman" w:cs="Times New Roman"/>
+          <w:kern w:val="0"/>
+          <w:sz w:val="24"/>
+          <w:szCs w:val="24"/>
+        </w:rPr>
+        <w:t xml:space="preserve">no broken </w:t>
+      </w:r>
+      <w:r>
+        <w:rPr>
+          <w:rFonts w:ascii="Times New Roman" w:eastAsia="Times New Roman" w:hAnsi="Times New Roman" w:cs="Times New Roman"/>
+          <w:kern w:val="0"/>
+          <w:sz w:val="24"/>
+          <w:szCs w:val="24"/>
+        </w:rPr>
+        <w:t xml:space="preserve">or disjointed </w:t>
+      </w:r>
+      <w:r>
+        <w:rPr>
+          <w:rFonts w:ascii="Times New Roman" w:eastAsia="Times New Roman" w:hAnsi="Times New Roman" w:cs="Times New Roman"/>
+          <w:kern w:val="0"/>
+          <w:sz w:val="24"/>
+          <w:szCs w:val="24"/>
+        </w:rPr>
+        <w:t>sections.</w:t>
+      </w:r>
+    </w:p>
+    <w:p>
+      <w:pPr>
+        <w:spacing w:before="100" w:beforeAutospacing="1" w:after="100" w:afterAutospacing="1" w:line="240" w:lineRule="auto"/>
         <w:rPr>
           <w:rFonts w:ascii="Times New Roman" w:eastAsia="Times New Roman" w:hAnsi="Times New Roman" w:cs="Times New Roman"/>
           <w:kern w:val="0"/>
@@ -1628,34 +1932,41 @@
           <w:sz w:val="24"/>
           <w:szCs w:val="24"/>
         </w:rPr>
-        <w:t xml:space="preserve">Purpose: To judge correctness of language, richness, and mature style. </w:t>
-      </w:r>
-      <w:r>
-        <w:rPr>
-          <w:rFonts w:ascii="Times New Roman" w:eastAsia="Times New Roman" w:hAnsi="Times New Roman" w:cs="Times New Roman"/>
-          <w:kern w:val="0"/>
-          <w:sz w:val="24"/>
-          <w:szCs w:val="24"/>
-        </w:rPr>
-        <w:br/>
-      </w:r>
-      <w:r>
-        <w:rPr>
-          <w:rFonts w:ascii="Times New Roman" w:eastAsia="Times New Roman" w:hAnsi="Times New Roman" w:cs="Times New Roman"/>
-          <w:kern w:val="0"/>
-          <w:sz w:val="24"/>
-          <w:szCs w:val="24"/>
-        </w:rPr>
-        <w:br/>
-      </w:r>
-      <w:r>
-        <w:rPr>
-          <w:rFonts w:ascii="Times New Roman" w:eastAsia="Times New Roman" w:hAnsi="Times New Roman" w:cs="Times New Roman"/>
-          <w:kern w:val="0"/>
-          <w:sz w:val="24"/>
-          <w:szCs w:val="24"/>
-        </w:rPr>
-        <w:t>Key signs: Perfect grammar; suitable and varied words; natural or figurative language where suitable; short and clear; no unnecessary words.</w:t>
+        <w:t>Key indicators</w:t>
+      </w:r>
+      <w:r>
+        <w:rPr>
+          <w:rFonts w:ascii="Times New Roman" w:eastAsia="Times New Roman" w:hAnsi="Times New Roman" w:cs="Times New Roman"/>
+          <w:kern w:val="0"/>
+          <w:sz w:val="24"/>
+          <w:szCs w:val="24"/>
+        </w:rPr>
+        <w:t xml:space="preserve">: </w:t>
+      </w:r>
+    </w:p>
+    <w:p>
+      <w:pPr>
+        <w:pStyle w:val="ListParagraph"/>
+        <w:numPr>
+          <w:ilvl w:val="0"/>
+          <w:numId w:val="7"/>
+        </w:numPr>
+        <w:spacing w:before="100" w:beforeAutospacing="1" w:after="100" w:afterAutospacing="1" w:line="240" w:lineRule="auto"/>
+        <w:rPr>
+          <w:rFonts w:ascii="Times New Roman" w:eastAsia="Times New Roman" w:hAnsi="Times New Roman" w:cs="Times New Roman"/>
+          <w:kern w:val="0"/>
+          <w:sz w:val="24"/>
+          <w:szCs w:val="24"/>
+        </w:rPr>
+      </w:pPr>
+      <w:r>
+        <w:rPr>
+          <w:rFonts w:ascii="Times New Roman" w:eastAsia="Times New Roman" w:hAnsi="Times New Roman" w:cs="Times New Roman"/>
+          <w:kern w:val="0"/>
+          <w:sz w:val="24"/>
+          <w:szCs w:val="24"/>
+        </w:rPr>
+        <w:t>No grammatical mistakes should be present.</w:t>
       </w:r>
       <w:r>
         <w:rPr>
@@ -1669,9 +1980,10 @@
     </w:p>
     <w:p>
       <w:pPr>
+        <w:pStyle w:val="ListParagraph"/>
         <w:numPr>
-          <w:ilvl w:val="1"/>
-          <w:numId w:val="1"/>
+          <w:ilvl w:val="0"/>
+          <w:numId w:val="7"/>
         </w:numPr>
         <w:spacing w:before="100" w:beforeAutospacing="1" w:after="100" w:afterAutospacing="1" w:line="240" w:lineRule="auto"/>
         <w:rPr>
@@ -1688,14 +2000,33 @@
           <w:sz w:val="24"/>
           <w:szCs w:val="24"/>
         </w:rPr>
-        <w:t>Excellent (9–10 marks): Beautiful, mistake-free, and rich expression</w:t>
-      </w:r>
-    </w:p>
-    <w:p>
-      <w:pPr>
+        <w:t xml:space="preserve">Sentences should be </w:t>
+      </w:r>
+      <w:r>
+        <w:rPr>
+          <w:rFonts w:ascii="Times New Roman" w:eastAsia="Times New Roman" w:hAnsi="Times New Roman" w:cs="Times New Roman"/>
+          <w:kern w:val="0"/>
+          <w:sz w:val="24"/>
+          <w:szCs w:val="24"/>
+        </w:rPr>
+        <w:t>short and clear.</w:t>
+      </w:r>
+      <w:r>
+        <w:rPr>
+          <w:rFonts w:ascii="Times New Roman" w:eastAsia="Times New Roman" w:hAnsi="Times New Roman" w:cs="Times New Roman"/>
+          <w:kern w:val="0"/>
+          <w:sz w:val="24"/>
+          <w:szCs w:val="24"/>
+        </w:rPr>
+        <w:t xml:space="preserve"> </w:t>
+      </w:r>
+    </w:p>
+    <w:p>
+      <w:pPr>
+        <w:pStyle w:val="ListParagraph"/>
         <w:numPr>
-          <w:ilvl w:val="1"/>
-          <w:numId w:val="1"/>
+          <w:ilvl w:val="0"/>
+          <w:numId w:val="7"/>
         </w:numPr>
         <w:spacing w:before="100" w:beforeAutospacing="1" w:after="100" w:afterAutospacing="1" w:line="240" w:lineRule="auto"/>
         <w:rPr>
@@ -1712,61 +2043,66 @@
           <w:sz w:val="24"/>
           <w:szCs w:val="24"/>
         </w:rPr>
-        <w:t>Good (7–8 marks): Clear with small mistakes; okay vocabulary</w:t>
-      </w:r>
-    </w:p>
-    <w:p>
-      <w:pPr>
-        <w:numPr>
-          <w:ilvl w:val="1"/>
-          <w:numId w:val="1"/>
-        </w:numPr>
-        <w:spacing w:before="100" w:beforeAutospacing="1" w:after="100" w:afterAutospacing="1" w:line="240" w:lineRule="auto"/>
-        <w:rPr>
-          <w:rFonts w:ascii="Times New Roman" w:eastAsia="Times New Roman" w:hAnsi="Times New Roman" w:cs="Times New Roman"/>
-          <w:kern w:val="0"/>
-          <w:sz w:val="24"/>
-          <w:szCs w:val="24"/>
-        </w:rPr>
-      </w:pPr>
-      <w:r>
-        <w:rPr>
-          <w:rFonts w:ascii="Times New Roman" w:eastAsia="Times New Roman" w:hAnsi="Times New Roman" w:cs="Times New Roman"/>
-          <w:kern w:val="0"/>
-          <w:sz w:val="24"/>
-          <w:szCs w:val="24"/>
-        </w:rPr>
-        <w:t>Average (4–6 marks): Many grammar or spelling mistakes; simple style</w:t>
-      </w:r>
-    </w:p>
-    <w:p>
-      <w:pPr>
-        <w:numPr>
-          <w:ilvl w:val="1"/>
-          <w:numId w:val="1"/>
-        </w:numPr>
-        <w:spacing w:before="100" w:beforeAutospacing="1" w:after="100" w:afterAutospacing="1" w:line="240" w:lineRule="auto"/>
-        <w:rPr>
-          <w:rFonts w:ascii="Times New Roman" w:eastAsia="Times New Roman" w:hAnsi="Times New Roman" w:cs="Times New Roman"/>
-          <w:kern w:val="0"/>
-          <w:sz w:val="24"/>
-          <w:szCs w:val="24"/>
-        </w:rPr>
-      </w:pPr>
-      <w:r>
-        <w:rPr>
-          <w:rFonts w:ascii="Times New Roman" w:eastAsia="Times New Roman" w:hAnsi="Times New Roman" w:cs="Times New Roman"/>
-          <w:kern w:val="0"/>
-          <w:sz w:val="24"/>
-          <w:szCs w:val="24"/>
-        </w:rPr>
-        <w:t>Weak (0–3 marks): Serious mistakes that make the language unclear or wrong</w:t>
-      </w:r>
-    </w:p>
-    <w:p>
-      <w:pPr>
-        <w:spacing w:before="100" w:beforeAutospacing="1" w:after="100" w:afterAutospacing="1" w:line="240" w:lineRule="auto"/>
-        <w:ind w:left="720"/>
+        <w:t>N</w:t>
+      </w:r>
+      <w:r>
+        <w:rPr>
+          <w:rFonts w:ascii="Times New Roman" w:eastAsia="Times New Roman" w:hAnsi="Times New Roman" w:cs="Times New Roman"/>
+          <w:kern w:val="0"/>
+          <w:sz w:val="24"/>
+          <w:szCs w:val="24"/>
+        </w:rPr>
+        <w:t xml:space="preserve">o </w:t>
+      </w:r>
+      <w:r>
+        <w:rPr>
+          <w:rFonts w:ascii="Times New Roman" w:eastAsia="Times New Roman" w:hAnsi="Times New Roman" w:cs="Times New Roman"/>
+          <w:kern w:val="0"/>
+          <w:sz w:val="24"/>
+          <w:szCs w:val="24"/>
+        </w:rPr>
+        <w:t>verbose or flowery</w:t>
+      </w:r>
+      <w:r>
+        <w:rPr>
+          <w:rFonts w:ascii="Times New Roman" w:eastAsia="Times New Roman" w:hAnsi="Times New Roman" w:cs="Times New Roman"/>
+          <w:kern w:val="0"/>
+          <w:sz w:val="24"/>
+          <w:szCs w:val="24"/>
+        </w:rPr>
+        <w:t xml:space="preserve"> </w:t>
+      </w:r>
+      <w:r>
+        <w:rPr>
+          <w:rFonts w:ascii="Times New Roman" w:eastAsia="Times New Roman" w:hAnsi="Times New Roman" w:cs="Times New Roman"/>
+          <w:kern w:val="0"/>
+          <w:sz w:val="24"/>
+          <w:szCs w:val="24"/>
+        </w:rPr>
+        <w:t>language should be used</w:t>
+      </w:r>
+      <w:r>
+        <w:rPr>
+          <w:rFonts w:ascii="Times New Roman" w:eastAsia="Times New Roman" w:hAnsi="Times New Roman" w:cs="Times New Roman"/>
+          <w:kern w:val="0"/>
+          <w:sz w:val="24"/>
+          <w:szCs w:val="24"/>
+        </w:rPr>
+        <w:t>.</w:t>
+      </w:r>
+      <w:r>
+        <w:rPr>
+          <w:rFonts w:ascii="Times New Roman" w:eastAsia="Times New Roman" w:hAnsi="Times New Roman" w:cs="Times New Roman"/>
+          <w:kern w:val="0"/>
+          <w:sz w:val="24"/>
+          <w:szCs w:val="24"/>
+        </w:rPr>
+        <w:t xml:space="preserve"> </w:t>
+      </w:r>
+    </w:p>
+    <w:p>
+      <w:pPr>
+        <w:spacing w:before="100" w:beforeAutospacing="1" w:after="100" w:afterAutospacing="1" w:line="240" w:lineRule="auto"/>
         <w:rPr>
           <w:rFonts w:ascii="Times New Roman" w:eastAsia="Times New Roman" w:hAnsi="Times New Roman" w:cs="Times New Roman"/>
           <w:kern w:val="0"/>
@@ -1783,6 +2119,7 @@
           <w:sz w:val="24"/>
           <w:szCs w:val="24"/>
         </w:rPr>
+        <w:lastRenderedPageBreak/>
         <w:t>8. Conclusion &amp; Overall Impression (5 Marks)</w:t>
       </w:r>
       <w:r>
@@ -1819,41 +2156,24 @@
           <w:sz w:val="24"/>
           <w:szCs w:val="24"/>
         </w:rPr>
-        <w:t xml:space="preserve">Purpose: To check the ending summary, strengthening of thesis, and lasting effect. </w:t>
-      </w:r>
-      <w:r>
-        <w:rPr>
-          <w:rFonts w:ascii="Times New Roman" w:eastAsia="Times New Roman" w:hAnsi="Times New Roman" w:cs="Times New Roman"/>
-          <w:kern w:val="0"/>
-          <w:sz w:val="24"/>
-          <w:szCs w:val="24"/>
-        </w:rPr>
-        <w:br/>
-      </w:r>
-      <w:r>
-        <w:rPr>
-          <w:rFonts w:ascii="Times New Roman" w:eastAsia="Times New Roman" w:hAnsi="Times New Roman" w:cs="Times New Roman"/>
-          <w:kern w:val="0"/>
-          <w:sz w:val="24"/>
-          <w:szCs w:val="24"/>
-        </w:rPr>
-        <w:br/>
-      </w:r>
-      <w:r>
-        <w:rPr>
-          <w:rFonts w:ascii="Times New Roman" w:eastAsia="Times New Roman" w:hAnsi="Times New Roman" w:cs="Times New Roman"/>
-          <w:kern w:val="0"/>
-          <w:sz w:val="24"/>
-          <w:szCs w:val="24"/>
-        </w:rPr>
-        <w:t>Key signs: Thoughtful ending; strengthens the position; leaves a strong final feeling; no new ideas added.</w:t>
-      </w:r>
-    </w:p>
-    <w:p>
-      <w:pPr>
+        <w:t>Key indicators</w:t>
+      </w:r>
+      <w:r>
+        <w:rPr>
+          <w:rFonts w:ascii="Times New Roman" w:eastAsia="Times New Roman" w:hAnsi="Times New Roman" w:cs="Times New Roman"/>
+          <w:kern w:val="0"/>
+          <w:sz w:val="24"/>
+          <w:szCs w:val="24"/>
+        </w:rPr>
+        <w:t xml:space="preserve">: </w:t>
+      </w:r>
+    </w:p>
+    <w:p>
+      <w:pPr>
+        <w:pStyle w:val="ListParagraph"/>
         <w:numPr>
-          <w:ilvl w:val="1"/>
-          <w:numId w:val="1"/>
+          <w:ilvl w:val="0"/>
+          <w:numId w:val="8"/>
         </w:numPr>
         <w:spacing w:before="100" w:beforeAutospacing="1" w:after="100" w:afterAutospacing="1" w:line="240" w:lineRule="auto"/>
         <w:rPr>
@@ -1870,14 +2190,24 @@
           <w:sz w:val="24"/>
           <w:szCs w:val="24"/>
         </w:rPr>
-        <w:t>Excellent (5 marks): Strong and thoughtful ending with lasting effect</w:t>
-      </w:r>
-    </w:p>
-    <w:p>
-      <w:pPr>
+        <w:t>Conclusion should have a t</w:t>
+      </w:r>
+      <w:r>
+        <w:rPr>
+          <w:rFonts w:ascii="Times New Roman" w:eastAsia="Times New Roman" w:hAnsi="Times New Roman" w:cs="Times New Roman"/>
+          <w:kern w:val="0"/>
+          <w:sz w:val="24"/>
+          <w:szCs w:val="24"/>
+        </w:rPr>
+        <w:t xml:space="preserve">houghtful ending; </w:t>
+      </w:r>
+    </w:p>
+    <w:p>
+      <w:pPr>
+        <w:pStyle w:val="ListParagraph"/>
         <w:numPr>
-          <w:ilvl w:val="1"/>
-          <w:numId w:val="1"/>
+          <w:ilvl w:val="0"/>
+          <w:numId w:val="8"/>
         </w:numPr>
         <w:spacing w:before="100" w:beforeAutospacing="1" w:after="100" w:afterAutospacing="1" w:line="240" w:lineRule="auto"/>
         <w:rPr>
@@ -1894,14 +2224,42 @@
           <w:sz w:val="24"/>
           <w:szCs w:val="24"/>
         </w:rPr>
-        <w:t>Good (4 marks): Clear summary and strengthening with small weaknesses</w:t>
-      </w:r>
-    </w:p>
-    <w:p>
-      <w:pPr>
+        <w:t>Reinstate the original stance or</w:t>
+      </w:r>
+      <w:r>
+        <w:rPr>
+          <w:rFonts w:ascii="Times New Roman" w:eastAsia="Times New Roman" w:hAnsi="Times New Roman" w:cs="Times New Roman"/>
+          <w:kern w:val="0"/>
+          <w:sz w:val="24"/>
+          <w:szCs w:val="24"/>
+        </w:rPr>
+        <w:t xml:space="preserve"> position</w:t>
+      </w:r>
+      <w:r>
+        <w:rPr>
+          <w:rFonts w:ascii="Times New Roman" w:eastAsia="Times New Roman" w:hAnsi="Times New Roman" w:cs="Times New Roman"/>
+          <w:kern w:val="0"/>
+          <w:sz w:val="24"/>
+          <w:szCs w:val="24"/>
+        </w:rPr>
+        <w:t xml:space="preserve"> of the student</w:t>
+      </w:r>
+      <w:r>
+        <w:rPr>
+          <w:rFonts w:ascii="Times New Roman" w:eastAsia="Times New Roman" w:hAnsi="Times New Roman" w:cs="Times New Roman"/>
+          <w:kern w:val="0"/>
+          <w:sz w:val="24"/>
+          <w:szCs w:val="24"/>
+        </w:rPr>
+        <w:t xml:space="preserve">; </w:t>
+      </w:r>
+    </w:p>
+    <w:p>
+      <w:pPr>
+        <w:pStyle w:val="ListParagraph"/>
         <w:numPr>
-          <w:ilvl w:val="1"/>
-          <w:numId w:val="1"/>
+          <w:ilvl w:val="0"/>
+          <w:numId w:val="8"/>
         </w:numPr>
         <w:spacing w:before="100" w:beforeAutospacing="1" w:after="100" w:afterAutospacing="1" w:line="240" w:lineRule="auto"/>
         <w:rPr>
@@ -1918,43 +2276,40 @@
           <w:sz w:val="24"/>
           <w:szCs w:val="24"/>
         </w:rPr>
-        <w:t>Average (2–3 marks): Simple or sudden restatement</w:t>
-      </w:r>
-    </w:p>
-    <w:p>
-      <w:pPr>
-        <w:numPr>
-          <w:ilvl w:val="1"/>
-          <w:numId w:val="1"/>
-        </w:numPr>
-        <w:spacing w:before="100" w:beforeAutospacing="1" w:after="100" w:afterAutospacing="1" w:line="240" w:lineRule="auto"/>
-        <w:rPr>
-          <w:rFonts w:ascii="Times New Roman" w:eastAsia="Times New Roman" w:hAnsi="Times New Roman" w:cs="Times New Roman"/>
-          <w:kern w:val="0"/>
-          <w:sz w:val="24"/>
-          <w:szCs w:val="24"/>
-        </w:rPr>
-      </w:pPr>
-      <w:r>
-        <w:rPr>
-          <w:rFonts w:ascii="Times New Roman" w:eastAsia="Times New Roman" w:hAnsi="Times New Roman" w:cs="Times New Roman"/>
-          <w:kern w:val="0"/>
-          <w:sz w:val="24"/>
-          <w:szCs w:val="24"/>
-        </w:rPr>
-        <w:t>Weak (0–1 mark): Weak, missing, repeated, or adds new material</w:t>
+        <w:t>N</w:t>
+      </w:r>
+      <w:r>
+        <w:rPr>
+          <w:rFonts w:ascii="Times New Roman" w:eastAsia="Times New Roman" w:hAnsi="Times New Roman" w:cs="Times New Roman"/>
+          <w:kern w:val="0"/>
+          <w:sz w:val="24"/>
+          <w:szCs w:val="24"/>
+        </w:rPr>
+        <w:t xml:space="preserve">o new ideas </w:t>
+      </w:r>
+      <w:r>
+        <w:rPr>
+          <w:rFonts w:ascii="Times New Roman" w:eastAsia="Times New Roman" w:hAnsi="Times New Roman" w:cs="Times New Roman"/>
+          <w:kern w:val="0"/>
+          <w:sz w:val="24"/>
+          <w:szCs w:val="24"/>
+        </w:rPr>
+        <w:t>should be introduced</w:t>
+      </w:r>
+      <w:r>
+        <w:rPr>
+          <w:rFonts w:ascii="Times New Roman" w:eastAsia="Times New Roman" w:hAnsi="Times New Roman" w:cs="Times New Roman"/>
+          <w:kern w:val="0"/>
+          <w:sz w:val="24"/>
+          <w:szCs w:val="24"/>
+        </w:rPr>
+        <w:t>.</w:t>
       </w:r>
     </w:p>
     <w:p>
       <w:pPr>
         <w:spacing w:before="100" w:beforeAutospacing="1" w:after="100" w:afterAutospacing="1" w:line="240" w:lineRule="auto"/>
         <w:ind w:left="720"/>
-        <w:rPr>
-          <w:rFonts w:ascii="Times New Roman" w:eastAsia="Times New Roman" w:hAnsi="Times New Roman" w:cs="Times New Roman"/>
-          <w:kern w:val="0"/>
-          <w:sz w:val="24"/>
-          <w:szCs w:val="24"/>
-        </w:rPr>
       </w:pPr>
       <w:r>
         <w:rPr>
@@ -1967,41 +2322,7 @@
         </w:rPr>
         <w:br/>
       </w:r>
-      <w:r>
-        <w:rPr>
-          <w:rFonts w:ascii="Times New Roman" w:eastAsia="Times New Roman" w:hAnsi="Times New Roman" w:cs="Times New Roman"/>
-          <w:b/>
-          <w:bCs/>
-          <w:kern w:val="0"/>
-          <w:sz w:val="24"/>
-          <w:szCs w:val="24"/>
-        </w:rPr>
-        <w:br/>
-      </w:r>
-      <w:r>
-        <w:rPr>
-          <w:rFonts w:ascii="Times New Roman" w:eastAsia="Times New Roman" w:hAnsi="Times New Roman" w:cs="Times New Roman"/>
-          <w:b/>
-          <w:bCs/>
-          <w:kern w:val="0"/>
-          <w:sz w:val="24"/>
-          <w:szCs w:val="24"/>
-        </w:rPr>
-        <w:br/>
-      </w:r>
-      <w:r>
-        <w:rPr>
-          <w:rFonts w:ascii="Times New Roman" w:eastAsia="Times New Roman" w:hAnsi="Times New Roman" w:cs="Times New Roman"/>
-          <w:b/>
-          <w:bCs/>
-          <w:kern w:val="0"/>
-          <w:sz w:val="24"/>
-          <w:szCs w:val="24"/>
-        </w:rPr>
-        <w:br/>
-      </w:r>
-    </w:p>
-    <w:p/>
+    </w:p>
     <w:sectPr>
       <w:pgSz w:w="11906" w:h="16838"/>
       <w:pgMar w:top="1440" w:right="1440" w:bottom="1440" w:left="1440" w:header="708" w:footer="708" w:gutter="0"/>
@@ -2015,6 +2336,458 @@
 <file path=word/numbering.xml><?xml version="1.0" encoding="utf-8"?>
 <w:numbering xmlns:ve="http://schemas.openxmlformats.org/markup-compatibility/2006" xmlns:o="urn:schemas-microsoft-com:office:office" xmlns:r="http://schemas.openxmlformats.org/officeDocument/2006/relationships" xmlns:m="http://schemas.openxmlformats.org/officeDocument/2006/math" xmlns:v="urn:schemas-microsoft-com:vml" xmlns:wp="http://schemas.openxmlformats.org/drawingml/2006/wordprocessingDrawing" xmlns:w10="urn:schemas-microsoft-com:office:word" xmlns:w="http://schemas.openxmlformats.org/wordprocessingml/2006/main" xmlns:wne="http://schemas.microsoft.com/office/word/2006/wordml">
   <w:abstractNum w:abstractNumId="0">
+    <w:nsid w:val="037D789B"/>
+    <w:multiLevelType w:val="hybridMultilevel"/>
+    <w:tmpl w:val="6D8E5D44"/>
+    <w:lvl w:ilvl="0" w:tplc="04090001">
+      <w:start w:val="1"/>
+      <w:numFmt w:val="bullet"/>
+      <w:lvlText w:val=""/>
+      <w:lvlJc w:val="left"/>
+      <w:pPr>
+        <w:ind w:left="1080" w:hanging="360"/>
+      </w:pPr>
+      <w:rPr>
+        <w:rFonts w:ascii="Symbol" w:hAnsi="Symbol" w:hint="default"/>
+      </w:rPr>
+    </w:lvl>
+    <w:lvl w:ilvl="1" w:tplc="04090003" w:tentative="1">
+      <w:start w:val="1"/>
+      <w:numFmt w:val="bullet"/>
+      <w:lvlText w:val="o"/>
+      <w:lvlJc w:val="left"/>
+      <w:pPr>
+        <w:ind w:left="1800" w:hanging="360"/>
+      </w:pPr>
+      <w:rPr>
+        <w:rFonts w:ascii="Courier New" w:hAnsi="Courier New" w:cs="Courier New" w:hint="default"/>
+      </w:rPr>
+    </w:lvl>
+    <w:lvl w:ilvl="2" w:tplc="04090005" w:tentative="1">
+      <w:start w:val="1"/>
+      <w:numFmt w:val="bullet"/>
+      <w:lvlText w:val=""/>
+      <w:lvlJc w:val="left"/>
+      <w:pPr>
+        <w:ind w:left="2520" w:hanging="360"/>
+      </w:pPr>
+      <w:rPr>
+        <w:rFonts w:ascii="Wingdings" w:hAnsi="Wingdings" w:hint="default"/>
+      </w:rPr>
+    </w:lvl>
+    <w:lvl w:ilvl="3" w:tplc="04090001" w:tentative="1">
+      <w:start w:val="1"/>
+      <w:numFmt w:val="bullet"/>
+      <w:lvlText w:val=""/>
+      <w:lvlJc w:val="left"/>
+      <w:pPr>
+        <w:ind w:left="3240" w:hanging="360"/>
+      </w:pPr>
+      <w:rPr>
+        <w:rFonts w:ascii="Symbol" w:hAnsi="Symbol" w:hint="default"/>
+      </w:rPr>
+    </w:lvl>
+    <w:lvl w:ilvl="4" w:tplc="04090003" w:tentative="1">
+      <w:start w:val="1"/>
+      <w:numFmt w:val="bullet"/>
+      <w:lvlText w:val="o"/>
+      <w:lvlJc w:val="left"/>
+      <w:pPr>
+        <w:ind w:left="3960" w:hanging="360"/>
+      </w:pPr>
+      <w:rPr>
+        <w:rFonts w:ascii="Courier New" w:hAnsi="Courier New" w:cs="Courier New" w:hint="default"/>
+      </w:rPr>
+    </w:lvl>
+    <w:lvl w:ilvl="5" w:tplc="04090005" w:tentative="1">
+      <w:start w:val="1"/>
+      <w:numFmt w:val="bullet"/>
+      <w:lvlText w:val=""/>
+      <w:lvlJc w:val="left"/>
+      <w:pPr>
+        <w:ind w:left="4680" w:hanging="360"/>
+      </w:pPr>
+      <w:rPr>
+        <w:rFonts w:ascii="Wingdings" w:hAnsi="Wingdings" w:hint="default"/>
+      </w:rPr>
+    </w:lvl>
+    <w:lvl w:ilvl="6" w:tplc="04090001" w:tentative="1">
+      <w:start w:val="1"/>
+      <w:numFmt w:val="bullet"/>
+      <w:lvlText w:val=""/>
+      <w:lvlJc w:val="left"/>
+      <w:pPr>
+        <w:ind w:left="5400" w:hanging="360"/>
+      </w:pPr>
+      <w:rPr>
+        <w:rFonts w:ascii="Symbol" w:hAnsi="Symbol" w:hint="default"/>
+      </w:rPr>
+    </w:lvl>
+    <w:lvl w:ilvl="7" w:tplc="04090003" w:tentative="1">
+      <w:start w:val="1"/>
+      <w:numFmt w:val="bullet"/>
+      <w:lvlText w:val="o"/>
+      <w:lvlJc w:val="left"/>
+      <w:pPr>
+        <w:ind w:left="6120" w:hanging="360"/>
+      </w:pPr>
+      <w:rPr>
+        <w:rFonts w:ascii="Courier New" w:hAnsi="Courier New" w:cs="Courier New" w:hint="default"/>
+      </w:rPr>
+    </w:lvl>
+    <w:lvl w:ilvl="8" w:tplc="04090005" w:tentative="1">
+      <w:start w:val="1"/>
+      <w:numFmt w:val="bullet"/>
+      <w:lvlText w:val=""/>
+      <w:lvlJc w:val="left"/>
+      <w:pPr>
+        <w:ind w:left="6840" w:hanging="360"/>
+      </w:pPr>
+      <w:rPr>
+        <w:rFonts w:ascii="Wingdings" w:hAnsi="Wingdings" w:hint="default"/>
+      </w:rPr>
+    </w:lvl>
+  </w:abstractNum>
+  <w:abstractNum w:abstractNumId="1">
+    <w:nsid w:val="0DC876EA"/>
+    <w:multiLevelType w:val="hybridMultilevel"/>
+    <w:tmpl w:val="6F824B7C"/>
+    <w:lvl w:ilvl="0" w:tplc="04090001">
+      <w:start w:val="1"/>
+      <w:numFmt w:val="bullet"/>
+      <w:lvlText w:val=""/>
+      <w:lvlJc w:val="left"/>
+      <w:pPr>
+        <w:ind w:left="720" w:hanging="360"/>
+      </w:pPr>
+      <w:rPr>
+        <w:rFonts w:ascii="Symbol" w:hAnsi="Symbol" w:hint="default"/>
+      </w:rPr>
+    </w:lvl>
+    <w:lvl w:ilvl="1" w:tplc="04090003" w:tentative="1">
+      <w:start w:val="1"/>
+      <w:numFmt w:val="bullet"/>
+      <w:lvlText w:val="o"/>
+      <w:lvlJc w:val="left"/>
+      <w:pPr>
+        <w:ind w:left="1440" w:hanging="360"/>
+      </w:pPr>
+      <w:rPr>
+        <w:rFonts w:ascii="Courier New" w:hAnsi="Courier New" w:cs="Courier New" w:hint="default"/>
+      </w:rPr>
+    </w:lvl>
+    <w:lvl w:ilvl="2" w:tplc="04090005" w:tentative="1">
+      <w:start w:val="1"/>
+      <w:numFmt w:val="bullet"/>
+      <w:lvlText w:val=""/>
+      <w:lvlJc w:val="left"/>
+      <w:pPr>
+        <w:ind w:left="2160" w:hanging="360"/>
+      </w:pPr>
+      <w:rPr>
+        <w:rFonts w:ascii="Wingdings" w:hAnsi="Wingdings" w:hint="default"/>
+      </w:rPr>
+    </w:lvl>
+    <w:lvl w:ilvl="3" w:tplc="04090001" w:tentative="1">
+      <w:start w:val="1"/>
+      <w:numFmt w:val="bullet"/>
+      <w:lvlText w:val=""/>
+      <w:lvlJc w:val="left"/>
+      <w:pPr>
+        <w:ind w:left="2880" w:hanging="360"/>
+      </w:pPr>
+      <w:rPr>
+        <w:rFonts w:ascii="Symbol" w:hAnsi="Symbol" w:hint="default"/>
+      </w:rPr>
+    </w:lvl>
+    <w:lvl w:ilvl="4" w:tplc="04090003" w:tentative="1">
+      <w:start w:val="1"/>
+      <w:numFmt w:val="bullet"/>
+      <w:lvlText w:val="o"/>
+      <w:lvlJc w:val="left"/>
+      <w:pPr>
+        <w:ind w:left="3600" w:hanging="360"/>
+      </w:pPr>
+      <w:rPr>
+        <w:rFonts w:ascii="Courier New" w:hAnsi="Courier New" w:cs="Courier New" w:hint="default"/>
+      </w:rPr>
+    </w:lvl>
+    <w:lvl w:ilvl="5" w:tplc="04090005" w:tentative="1">
+      <w:start w:val="1"/>
+      <w:numFmt w:val="bullet"/>
+      <w:lvlText w:val=""/>
+      <w:lvlJc w:val="left"/>
+      <w:pPr>
+        <w:ind w:left="4320" w:hanging="360"/>
+      </w:pPr>
+      <w:rPr>
+        <w:rFonts w:ascii="Wingdings" w:hAnsi="Wingdings" w:hint="default"/>
+      </w:rPr>
+    </w:lvl>
+    <w:lvl w:ilvl="6" w:tplc="04090001" w:tentative="1">
+      <w:start w:val="1"/>
+      <w:numFmt w:val="bullet"/>
+      <w:lvlText w:val=""/>
+      <w:lvlJc w:val="left"/>
+      <w:pPr>
+        <w:ind w:left="5040" w:hanging="360"/>
+      </w:pPr>
+      <w:rPr>
+        <w:rFonts w:ascii="Symbol" w:hAnsi="Symbol" w:hint="default"/>
+      </w:rPr>
+    </w:lvl>
+    <w:lvl w:ilvl="7" w:tplc="04090003" w:tentative="1">
+      <w:start w:val="1"/>
+      <w:numFmt w:val="bullet"/>
+      <w:lvlText w:val="o"/>
+      <w:lvlJc w:val="left"/>
+      <w:pPr>
+        <w:ind w:left="5760" w:hanging="360"/>
+      </w:pPr>
+      <w:rPr>
+        <w:rFonts w:ascii="Courier New" w:hAnsi="Courier New" w:cs="Courier New" w:hint="default"/>
+      </w:rPr>
+    </w:lvl>
+    <w:lvl w:ilvl="8" w:tplc="04090005" w:tentative="1">
+      <w:start w:val="1"/>
+      <w:numFmt w:val="bullet"/>
+      <w:lvlText w:val=""/>
+      <w:lvlJc w:val="left"/>
+      <w:pPr>
+        <w:ind w:left="6480" w:hanging="360"/>
+      </w:pPr>
+      <w:rPr>
+        <w:rFonts w:ascii="Wingdings" w:hAnsi="Wingdings" w:hint="default"/>
+      </w:rPr>
+    </w:lvl>
+  </w:abstractNum>
+  <w:abstractNum w:abstractNumId="2">
+    <w:nsid w:val="128F3CC4"/>
+    <w:multiLevelType w:val="hybridMultilevel"/>
+    <w:tmpl w:val="F9FE1FB8"/>
+    <w:lvl w:ilvl="0" w:tplc="04090001">
+      <w:start w:val="1"/>
+      <w:numFmt w:val="bullet"/>
+      <w:lvlText w:val=""/>
+      <w:lvlJc w:val="left"/>
+      <w:pPr>
+        <w:ind w:left="1080" w:hanging="360"/>
+      </w:pPr>
+      <w:rPr>
+        <w:rFonts w:ascii="Symbol" w:hAnsi="Symbol" w:hint="default"/>
+      </w:rPr>
+    </w:lvl>
+    <w:lvl w:ilvl="1" w:tplc="04090003" w:tentative="1">
+      <w:start w:val="1"/>
+      <w:numFmt w:val="bullet"/>
+      <w:lvlText w:val="o"/>
+      <w:lvlJc w:val="left"/>
+      <w:pPr>
+        <w:ind w:left="1800" w:hanging="360"/>
+      </w:pPr>
+      <w:rPr>
+        <w:rFonts w:ascii="Courier New" w:hAnsi="Courier New" w:cs="Courier New" w:hint="default"/>
+      </w:rPr>
+    </w:lvl>
+    <w:lvl w:ilvl="2" w:tplc="04090005" w:tentative="1">
+      <w:start w:val="1"/>
+      <w:numFmt w:val="bullet"/>
+      <w:lvlText w:val=""/>
+      <w:lvlJc w:val="left"/>
+      <w:pPr>
+        <w:ind w:left="2520" w:hanging="360"/>
+      </w:pPr>
+      <w:rPr>
+        <w:rFonts w:ascii="Wingdings" w:hAnsi="Wingdings" w:hint="default"/>
+      </w:rPr>
+    </w:lvl>
+    <w:lvl w:ilvl="3" w:tplc="04090001" w:tentative="1">
+      <w:start w:val="1"/>
+      <w:numFmt w:val="bullet"/>
+      <w:lvlText w:val=""/>
+      <w:lvlJc w:val="left"/>
+      <w:pPr>
+        <w:ind w:left="3240" w:hanging="360"/>
+      </w:pPr>
+      <w:rPr>
+        <w:rFonts w:ascii="Symbol" w:hAnsi="Symbol" w:hint="default"/>
+      </w:rPr>
+    </w:lvl>
+    <w:lvl w:ilvl="4" w:tplc="04090003" w:tentative="1">
+      <w:start w:val="1"/>
+      <w:numFmt w:val="bullet"/>
+      <w:lvlText w:val="o"/>
+      <w:lvlJc w:val="left"/>
+      <w:pPr>
+        <w:ind w:left="3960" w:hanging="360"/>
+      </w:pPr>
+      <w:rPr>
+        <w:rFonts w:ascii="Courier New" w:hAnsi="Courier New" w:cs="Courier New" w:hint="default"/>
+      </w:rPr>
+    </w:lvl>
+    <w:lvl w:ilvl="5" w:tplc="04090005" w:tentative="1">
+      <w:start w:val="1"/>
+      <w:numFmt w:val="bullet"/>
+      <w:lvlText w:val=""/>
+      <w:lvlJc w:val="left"/>
+      <w:pPr>
+        <w:ind w:left="4680" w:hanging="360"/>
+      </w:pPr>
+      <w:rPr>
+        <w:rFonts w:ascii="Wingdings" w:hAnsi="Wingdings" w:hint="default"/>
+      </w:rPr>
+    </w:lvl>
+    <w:lvl w:ilvl="6" w:tplc="04090001" w:tentative="1">
+      <w:start w:val="1"/>
+      <w:numFmt w:val="bullet"/>
+      <w:lvlText w:val=""/>
+      <w:lvlJc w:val="left"/>
+      <w:pPr>
+        <w:ind w:left="5400" w:hanging="360"/>
+      </w:pPr>
+      <w:rPr>
+        <w:rFonts w:ascii="Symbol" w:hAnsi="Symbol" w:hint="default"/>
+      </w:rPr>
+    </w:lvl>
+    <w:lvl w:ilvl="7" w:tplc="04090003" w:tentative="1">
+      <w:start w:val="1"/>
+      <w:numFmt w:val="bullet"/>
+      <w:lvlText w:val="o"/>
+      <w:lvlJc w:val="left"/>
+      <w:pPr>
+        <w:ind w:left="6120" w:hanging="360"/>
+      </w:pPr>
+      <w:rPr>
+        <w:rFonts w:ascii="Courier New" w:hAnsi="Courier New" w:cs="Courier New" w:hint="default"/>
+      </w:rPr>
+    </w:lvl>
+    <w:lvl w:ilvl="8" w:tplc="04090005" w:tentative="1">
+      <w:start w:val="1"/>
+      <w:numFmt w:val="bullet"/>
+      <w:lvlText w:val=""/>
+      <w:lvlJc w:val="left"/>
+      <w:pPr>
+        <w:ind w:left="6840" w:hanging="360"/>
+      </w:pPr>
+      <w:rPr>
+        <w:rFonts w:ascii="Wingdings" w:hAnsi="Wingdings" w:hint="default"/>
+      </w:rPr>
+    </w:lvl>
+  </w:abstractNum>
+  <w:abstractNum w:abstractNumId="3">
+    <w:nsid w:val="22F42172"/>
+    <w:multiLevelType w:val="hybridMultilevel"/>
+    <w:tmpl w:val="767019F4"/>
+    <w:lvl w:ilvl="0" w:tplc="04090001">
+      <w:start w:val="1"/>
+      <w:numFmt w:val="bullet"/>
+      <w:lvlText w:val=""/>
+      <w:lvlJc w:val="left"/>
+      <w:pPr>
+        <w:ind w:left="1440" w:hanging="360"/>
+      </w:pPr>
+      <w:rPr>
+        <w:rFonts w:ascii="Symbol" w:hAnsi="Symbol" w:hint="default"/>
+      </w:rPr>
+    </w:lvl>
+    <w:lvl w:ilvl="1" w:tplc="04090003" w:tentative="1">
+      <w:start w:val="1"/>
+      <w:numFmt w:val="bullet"/>
+      <w:lvlText w:val="o"/>
+      <w:lvlJc w:val="left"/>
+      <w:pPr>
+        <w:ind w:left="2160" w:hanging="360"/>
+      </w:pPr>
+      <w:rPr>
+        <w:rFonts w:ascii="Courier New" w:hAnsi="Courier New" w:cs="Courier New" w:hint="default"/>
+      </w:rPr>
+    </w:lvl>
+    <w:lvl w:ilvl="2" w:tplc="04090005" w:tentative="1">
+      <w:start w:val="1"/>
+      <w:numFmt w:val="bullet"/>
+      <w:lvlText w:val=""/>
+      <w:lvlJc w:val="left"/>
+      <w:pPr>
+        <w:ind w:left="2880" w:hanging="360"/>
+      </w:pPr>
+      <w:rPr>
+        <w:rFonts w:ascii="Wingdings" w:hAnsi="Wingdings" w:hint="default"/>
+      </w:rPr>
+    </w:lvl>
+    <w:lvl w:ilvl="3" w:tplc="04090001" w:tentative="1">
+      <w:start w:val="1"/>
+      <w:numFmt w:val="bullet"/>
+      <w:lvlText w:val=""/>
+      <w:lvlJc w:val="left"/>
+      <w:pPr>
+        <w:ind w:left="3600" w:hanging="360"/>
+      </w:pPr>
+      <w:rPr>
+        <w:rFonts w:ascii="Symbol" w:hAnsi="Symbol" w:hint="default"/>
+      </w:rPr>
+    </w:lvl>
+    <w:lvl w:ilvl="4" w:tplc="04090003" w:tentative="1">
+      <w:start w:val="1"/>
+      <w:numFmt w:val="bullet"/>
+      <w:lvlText w:val="o"/>
+      <w:lvlJc w:val="left"/>
+      <w:pPr>
+        <w:ind w:left="4320" w:hanging="360"/>
+      </w:pPr>
+      <w:rPr>
+        <w:rFonts w:ascii="Courier New" w:hAnsi="Courier New" w:cs="Courier New" w:hint="default"/>
+      </w:rPr>
+    </w:lvl>
+    <w:lvl w:ilvl="5" w:tplc="04090005" w:tentative="1">
+      <w:start w:val="1"/>
+      <w:numFmt w:val="bullet"/>
+      <w:lvlText w:val=""/>
+      <w:lvlJc w:val="left"/>
+      <w:pPr>
+        <w:ind w:left="5040" w:hanging="360"/>
+      </w:pPr>
+      <w:rPr>
+        <w:rFonts w:ascii="Wingdings" w:hAnsi="Wingdings" w:hint="default"/>
+      </w:rPr>
+    </w:lvl>
+    <w:lvl w:ilvl="6" w:tplc="04090001" w:tentative="1">
+      <w:start w:val="1"/>
+      <w:numFmt w:val="bullet"/>
+      <w:lvlText w:val=""/>
+      <w:lvlJc w:val="left"/>
+      <w:pPr>
+        <w:ind w:left="5760" w:hanging="360"/>
+      </w:pPr>
+      <w:rPr>
+        <w:rFonts w:ascii="Symbol" w:hAnsi="Symbol" w:hint="default"/>
+      </w:rPr>
+    </w:lvl>
+    <w:lvl w:ilvl="7" w:tplc="04090003" w:tentative="1">
+      <w:start w:val="1"/>
+      <w:numFmt w:val="bullet"/>
+      <w:lvlText w:val="o"/>
+      <w:lvlJc w:val="left"/>
+      <w:pPr>
+        <w:ind w:left="6480" w:hanging="360"/>
+      </w:pPr>
+      <w:rPr>
+        <w:rFonts w:ascii="Courier New" w:hAnsi="Courier New" w:cs="Courier New" w:hint="default"/>
+      </w:rPr>
+    </w:lvl>
+    <w:lvl w:ilvl="8" w:tplc="04090005" w:tentative="1">
+      <w:start w:val="1"/>
+      <w:numFmt w:val="bullet"/>
+      <w:lvlText w:val=""/>
+      <w:lvlJc w:val="left"/>
+      <w:pPr>
+        <w:ind w:left="7200" w:hanging="360"/>
+      </w:pPr>
+      <w:rPr>
+        <w:rFonts w:ascii="Wingdings" w:hAnsi="Wingdings" w:hint="default"/>
+      </w:rPr>
+    </w:lvl>
+  </w:abstractNum>
+  <w:abstractNum w:abstractNumId="4">
     <w:nsid w:val="3139186A"/>
     <w:multiLevelType w:val="multilevel"/>
     <w:tmpl w:val="93824BDE"/>
@@ -2163,8 +2936,368 @@
       </w:rPr>
     </w:lvl>
   </w:abstractNum>
+  <w:abstractNum w:abstractNumId="5">
+    <w:nsid w:val="458410B4"/>
+    <w:multiLevelType w:val="hybridMultilevel"/>
+    <w:tmpl w:val="041E5A4E"/>
+    <w:lvl w:ilvl="0" w:tplc="04090001">
+      <w:start w:val="1"/>
+      <w:numFmt w:val="bullet"/>
+      <w:lvlText w:val=""/>
+      <w:lvlJc w:val="left"/>
+      <w:pPr>
+        <w:ind w:left="1440" w:hanging="360"/>
+      </w:pPr>
+      <w:rPr>
+        <w:rFonts w:ascii="Symbol" w:hAnsi="Symbol" w:hint="default"/>
+      </w:rPr>
+    </w:lvl>
+    <w:lvl w:ilvl="1" w:tplc="04090003" w:tentative="1">
+      <w:start w:val="1"/>
+      <w:numFmt w:val="bullet"/>
+      <w:lvlText w:val="o"/>
+      <w:lvlJc w:val="left"/>
+      <w:pPr>
+        <w:ind w:left="2160" w:hanging="360"/>
+      </w:pPr>
+      <w:rPr>
+        <w:rFonts w:ascii="Courier New" w:hAnsi="Courier New" w:cs="Courier New" w:hint="default"/>
+      </w:rPr>
+    </w:lvl>
+    <w:lvl w:ilvl="2" w:tplc="04090005" w:tentative="1">
+      <w:start w:val="1"/>
+      <w:numFmt w:val="bullet"/>
+      <w:lvlText w:val=""/>
+      <w:lvlJc w:val="left"/>
+      <w:pPr>
+        <w:ind w:left="2880" w:hanging="360"/>
+      </w:pPr>
+      <w:rPr>
+        <w:rFonts w:ascii="Wingdings" w:hAnsi="Wingdings" w:hint="default"/>
+      </w:rPr>
+    </w:lvl>
+    <w:lvl w:ilvl="3" w:tplc="04090001" w:tentative="1">
+      <w:start w:val="1"/>
+      <w:numFmt w:val="bullet"/>
+      <w:lvlText w:val=""/>
+      <w:lvlJc w:val="left"/>
+      <w:pPr>
+        <w:ind w:left="3600" w:hanging="360"/>
+      </w:pPr>
+      <w:rPr>
+        <w:rFonts w:ascii="Symbol" w:hAnsi="Symbol" w:hint="default"/>
+      </w:rPr>
+    </w:lvl>
+    <w:lvl w:ilvl="4" w:tplc="04090003" w:tentative="1">
+      <w:start w:val="1"/>
+      <w:numFmt w:val="bullet"/>
+      <w:lvlText w:val="o"/>
+      <w:lvlJc w:val="left"/>
+      <w:pPr>
+        <w:ind w:left="4320" w:hanging="360"/>
+      </w:pPr>
+      <w:rPr>
+        <w:rFonts w:ascii="Courier New" w:hAnsi="Courier New" w:cs="Courier New" w:hint="default"/>
+      </w:rPr>
+    </w:lvl>
+    <w:lvl w:ilvl="5" w:tplc="04090005" w:tentative="1">
+      <w:start w:val="1"/>
+      <w:numFmt w:val="bullet"/>
+      <w:lvlText w:val=""/>
+      <w:lvlJc w:val="left"/>
+      <w:pPr>
+        <w:ind w:left="5040" w:hanging="360"/>
+      </w:pPr>
+      <w:rPr>
+        <w:rFonts w:ascii="Wingdings" w:hAnsi="Wingdings" w:hint="default"/>
+      </w:rPr>
+    </w:lvl>
+    <w:lvl w:ilvl="6" w:tplc="04090001" w:tentative="1">
+      <w:start w:val="1"/>
+      <w:numFmt w:val="bullet"/>
+      <w:lvlText w:val=""/>
+      <w:lvlJc w:val="left"/>
+      <w:pPr>
+        <w:ind w:left="5760" w:hanging="360"/>
+      </w:pPr>
+      <w:rPr>
+        <w:rFonts w:ascii="Symbol" w:hAnsi="Symbol" w:hint="default"/>
+      </w:rPr>
+    </w:lvl>
+    <w:lvl w:ilvl="7" w:tplc="04090003" w:tentative="1">
+      <w:start w:val="1"/>
+      <w:numFmt w:val="bullet"/>
+      <w:lvlText w:val="o"/>
+      <w:lvlJc w:val="left"/>
+      <w:pPr>
+        <w:ind w:left="6480" w:hanging="360"/>
+      </w:pPr>
+      <w:rPr>
+        <w:rFonts w:ascii="Courier New" w:hAnsi="Courier New" w:cs="Courier New" w:hint="default"/>
+      </w:rPr>
+    </w:lvl>
+    <w:lvl w:ilvl="8" w:tplc="04090005" w:tentative="1">
+      <w:start w:val="1"/>
+      <w:numFmt w:val="bullet"/>
+      <w:lvlText w:val=""/>
+      <w:lvlJc w:val="left"/>
+      <w:pPr>
+        <w:ind w:left="7200" w:hanging="360"/>
+      </w:pPr>
+      <w:rPr>
+        <w:rFonts w:ascii="Wingdings" w:hAnsi="Wingdings" w:hint="default"/>
+      </w:rPr>
+    </w:lvl>
+  </w:abstractNum>
+  <w:abstractNum w:abstractNumId="6">
+    <w:nsid w:val="4C2A1BD8"/>
+    <w:multiLevelType w:val="hybridMultilevel"/>
+    <w:tmpl w:val="B59EF79E"/>
+    <w:lvl w:ilvl="0" w:tplc="04090001">
+      <w:start w:val="1"/>
+      <w:numFmt w:val="bullet"/>
+      <w:lvlText w:val=""/>
+      <w:lvlJc w:val="left"/>
+      <w:pPr>
+        <w:ind w:left="1440" w:hanging="360"/>
+      </w:pPr>
+      <w:rPr>
+        <w:rFonts w:ascii="Symbol" w:hAnsi="Symbol" w:hint="default"/>
+      </w:rPr>
+    </w:lvl>
+    <w:lvl w:ilvl="1" w:tplc="04090003" w:tentative="1">
+      <w:start w:val="1"/>
+      <w:numFmt w:val="bullet"/>
+      <w:lvlText w:val="o"/>
+      <w:lvlJc w:val="left"/>
+      <w:pPr>
+        <w:ind w:left="2160" w:hanging="360"/>
+      </w:pPr>
+      <w:rPr>
+        <w:rFonts w:ascii="Courier New" w:hAnsi="Courier New" w:cs="Courier New" w:hint="default"/>
+      </w:rPr>
+    </w:lvl>
+    <w:lvl w:ilvl="2" w:tplc="04090005" w:tentative="1">
+      <w:start w:val="1"/>
+      <w:numFmt w:val="bullet"/>
+      <w:lvlText w:val=""/>
+      <w:lvlJc w:val="left"/>
+      <w:pPr>
+        <w:ind w:left="2880" w:hanging="360"/>
+      </w:pPr>
+      <w:rPr>
+        <w:rFonts w:ascii="Wingdings" w:hAnsi="Wingdings" w:hint="default"/>
+      </w:rPr>
+    </w:lvl>
+    <w:lvl w:ilvl="3" w:tplc="04090001" w:tentative="1">
+      <w:start w:val="1"/>
+      <w:numFmt w:val="bullet"/>
+      <w:lvlText w:val=""/>
+      <w:lvlJc w:val="left"/>
+      <w:pPr>
+        <w:ind w:left="3600" w:hanging="360"/>
+      </w:pPr>
+      <w:rPr>
+        <w:rFonts w:ascii="Symbol" w:hAnsi="Symbol" w:hint="default"/>
+      </w:rPr>
+    </w:lvl>
+    <w:lvl w:ilvl="4" w:tplc="04090003" w:tentative="1">
+      <w:start w:val="1"/>
+      <w:numFmt w:val="bullet"/>
+      <w:lvlText w:val="o"/>
+      <w:lvlJc w:val="left"/>
+      <w:pPr>
+        <w:ind w:left="4320" w:hanging="360"/>
+      </w:pPr>
+      <w:rPr>
+        <w:rFonts w:ascii="Courier New" w:hAnsi="Courier New" w:cs="Courier New" w:hint="default"/>
+      </w:rPr>
+    </w:lvl>
+    <w:lvl w:ilvl="5" w:tplc="04090005" w:tentative="1">
+      <w:start w:val="1"/>
+      <w:numFmt w:val="bullet"/>
+      <w:lvlText w:val=""/>
+      <w:lvlJc w:val="left"/>
+      <w:pPr>
+        <w:ind w:left="5040" w:hanging="360"/>
+      </w:pPr>
+      <w:rPr>
+        <w:rFonts w:ascii="Wingdings" w:hAnsi="Wingdings" w:hint="default"/>
+      </w:rPr>
+    </w:lvl>
+    <w:lvl w:ilvl="6" w:tplc="04090001" w:tentative="1">
+      <w:start w:val="1"/>
+      <w:numFmt w:val="bullet"/>
+      <w:lvlText w:val=""/>
+      <w:lvlJc w:val="left"/>
+      <w:pPr>
+        <w:ind w:left="5760" w:hanging="360"/>
+      </w:pPr>
+      <w:rPr>
+        <w:rFonts w:ascii="Symbol" w:hAnsi="Symbol" w:hint="default"/>
+      </w:rPr>
+    </w:lvl>
+    <w:lvl w:ilvl="7" w:tplc="04090003" w:tentative="1">
+      <w:start w:val="1"/>
+      <w:numFmt w:val="bullet"/>
+      <w:lvlText w:val="o"/>
+      <w:lvlJc w:val="left"/>
+      <w:pPr>
+        <w:ind w:left="6480" w:hanging="360"/>
+      </w:pPr>
+      <w:rPr>
+        <w:rFonts w:ascii="Courier New" w:hAnsi="Courier New" w:cs="Courier New" w:hint="default"/>
+      </w:rPr>
+    </w:lvl>
+    <w:lvl w:ilvl="8" w:tplc="04090005" w:tentative="1">
+      <w:start w:val="1"/>
+      <w:numFmt w:val="bullet"/>
+      <w:lvlText w:val=""/>
+      <w:lvlJc w:val="left"/>
+      <w:pPr>
+        <w:ind w:left="7200" w:hanging="360"/>
+      </w:pPr>
+      <w:rPr>
+        <w:rFonts w:ascii="Wingdings" w:hAnsi="Wingdings" w:hint="default"/>
+      </w:rPr>
+    </w:lvl>
+  </w:abstractNum>
+  <w:abstractNum w:abstractNumId="7">
+    <w:nsid w:val="6A2301F5"/>
+    <w:multiLevelType w:val="hybridMultilevel"/>
+    <w:tmpl w:val="8F32E6BC"/>
+    <w:lvl w:ilvl="0" w:tplc="04090001">
+      <w:start w:val="1"/>
+      <w:numFmt w:val="bullet"/>
+      <w:lvlText w:val=""/>
+      <w:lvlJc w:val="left"/>
+      <w:pPr>
+        <w:ind w:left="1080" w:hanging="360"/>
+      </w:pPr>
+      <w:rPr>
+        <w:rFonts w:ascii="Symbol" w:hAnsi="Symbol" w:hint="default"/>
+      </w:rPr>
+    </w:lvl>
+    <w:lvl w:ilvl="1" w:tplc="04090003" w:tentative="1">
+      <w:start w:val="1"/>
+      <w:numFmt w:val="bullet"/>
+      <w:lvlText w:val="o"/>
+      <w:lvlJc w:val="left"/>
+      <w:pPr>
+        <w:ind w:left="1800" w:hanging="360"/>
+      </w:pPr>
+      <w:rPr>
+        <w:rFonts w:ascii="Courier New" w:hAnsi="Courier New" w:cs="Courier New" w:hint="default"/>
+      </w:rPr>
+    </w:lvl>
+    <w:lvl w:ilvl="2" w:tplc="04090005" w:tentative="1">
+      <w:start w:val="1"/>
+      <w:numFmt w:val="bullet"/>
+      <w:lvlText w:val=""/>
+      <w:lvlJc w:val="left"/>
+      <w:pPr>
+        <w:ind w:left="2520" w:hanging="360"/>
+      </w:pPr>
+      <w:rPr>
+        <w:rFonts w:ascii="Wingdings" w:hAnsi="Wingdings" w:hint="default"/>
+      </w:rPr>
+    </w:lvl>
+    <w:lvl w:ilvl="3" w:tplc="04090001" w:tentative="1">
+      <w:start w:val="1"/>
+      <w:numFmt w:val="bullet"/>
+      <w:lvlText w:val=""/>
+      <w:lvlJc w:val="left"/>
+      <w:pPr>
+        <w:ind w:left="3240" w:hanging="360"/>
+      </w:pPr>
+      <w:rPr>
+        <w:rFonts w:ascii="Symbol" w:hAnsi="Symbol" w:hint="default"/>
+      </w:rPr>
+    </w:lvl>
+    <w:lvl w:ilvl="4" w:tplc="04090003" w:tentative="1">
+      <w:start w:val="1"/>
+      <w:numFmt w:val="bullet"/>
+      <w:lvlText w:val="o"/>
+      <w:lvlJc w:val="left"/>
+      <w:pPr>
+        <w:ind w:left="3960" w:hanging="360"/>
+      </w:pPr>
+      <w:rPr>
+        <w:rFonts w:ascii="Courier New" w:hAnsi="Courier New" w:cs="Courier New" w:hint="default"/>
+      </w:rPr>
+    </w:lvl>
+    <w:lvl w:ilvl="5" w:tplc="04090005" w:tentative="1">
+      <w:start w:val="1"/>
+      <w:numFmt w:val="bullet"/>
+      <w:lvlText w:val=""/>
+      <w:lvlJc w:val="left"/>
+      <w:pPr>
+        <w:ind w:left="4680" w:hanging="360"/>
+      </w:pPr>
+      <w:rPr>
+        <w:rFonts w:ascii="Wingdings" w:hAnsi="Wingdings" w:hint="default"/>
+      </w:rPr>
+    </w:lvl>
+    <w:lvl w:ilvl="6" w:tplc="04090001" w:tentative="1">
+      <w:start w:val="1"/>
+      <w:numFmt w:val="bullet"/>
+      <w:lvlText w:val=""/>
+      <w:lvlJc w:val="left"/>
+      <w:pPr>
+        <w:ind w:left="5400" w:hanging="360"/>
+      </w:pPr>
+      <w:rPr>
+        <w:rFonts w:ascii="Symbol" w:hAnsi="Symbol" w:hint="default"/>
+      </w:rPr>
+    </w:lvl>
+    <w:lvl w:ilvl="7" w:tplc="04090003" w:tentative="1">
+      <w:start w:val="1"/>
+      <w:numFmt w:val="bullet"/>
+      <w:lvlText w:val="o"/>
+      <w:lvlJc w:val="left"/>
+      <w:pPr>
+        <w:ind w:left="6120" w:hanging="360"/>
+      </w:pPr>
+      <w:rPr>
+        <w:rFonts w:ascii="Courier New" w:hAnsi="Courier New" w:cs="Courier New" w:hint="default"/>
+      </w:rPr>
+    </w:lvl>
+    <w:lvl w:ilvl="8" w:tplc="04090005" w:tentative="1">
+      <w:start w:val="1"/>
+      <w:numFmt w:val="bullet"/>
+      <w:lvlText w:val=""/>
+      <w:lvlJc w:val="left"/>
+      <w:pPr>
+        <w:ind w:left="6840" w:hanging="360"/>
+      </w:pPr>
+      <w:rPr>
+        <w:rFonts w:ascii="Wingdings" w:hAnsi="Wingdings" w:hint="default"/>
+      </w:rPr>
+    </w:lvl>
+  </w:abstractNum>
   <w:num w:numId="1">
+    <w:abstractNumId w:val="4"/>
+  </w:num>
+  <w:num w:numId="2">
+    <w:abstractNumId w:val="3"/>
+  </w:num>
+  <w:num w:numId="3">
+    <w:abstractNumId w:val="5"/>
+  </w:num>
+  <w:num w:numId="4">
+    <w:abstractNumId w:val="6"/>
+  </w:num>
+  <w:num w:numId="5">
     <w:abstractNumId w:val="0"/>
+  </w:num>
+  <w:num w:numId="6">
+    <w:abstractNumId w:val="2"/>
+  </w:num>
+  <w:num w:numId="7">
+    <w:abstractNumId w:val="1"/>
+  </w:num>
+  <w:num w:numId="8">
+    <w:abstractNumId w:val="7"/>
   </w:num>
 </w:numbering>
 </file>
@@ -2386,6 +3519,17 @@
       <w:sz w:val="24"/>
       <w:szCs w:val="24"/>
     </w:rPr>
+  </w:style>
+  <w:style w:type="paragraph" w:styleId="ListParagraph">
+    <w:name w:val="List Paragraph"/>
+    <w:basedOn w:val="Normal"/>
+    <w:uiPriority w:val="34"/>
+    <w:qFormat/>
+    <w:rsid w:val="00937E93"/>
+    <w:pPr>
+      <w:ind w:left="720"/>
+      <w:contextualSpacing/>
+    </w:pPr>
   </w:style>
 </w:styles>
 </file>
@@ -2679,7 +3823,7 @@
   <a:extraClrSchemeLst/>
   <a:extLst>
     <a:ext uri="{05A4C25C-085E-4340-85A3-A5531E510DB2}">
-      <thm15:themeFamily xmlns="" xmlns:thm15="http://schemas.microsoft.com/office/thememl/2012/main" name="Office Theme" id="{62F939B6-93AF-4DB8-9C6B-D6C7DFDC589F}" vid="{4A3C46E8-61CC-4603-A589-7422A47A8E4A}"/>
+      <thm15:themeFamily xmlns:thm15="http://schemas.microsoft.com/office/thememl/2012/main" xmlns="" name="Office Theme" id="{62F939B6-93AF-4DB8-9C6B-D6C7DFDC589F}" vid="{4A3C46E8-61CC-4603-A589-7422A47A8E4A}"/>
     </a:ext>
   </a:extLst>
 </a:theme>

</xml_diff>